<commit_message>
Update new video URL and add AI section to final report and append AI chat history
</commit_message>
<xml_diff>
--- a/Documentation/ERR_Expenses_Web_App_FINAL_Report.docx
+++ b/Documentation/ERR_Expenses_Web_App_FINAL_Report.docx
@@ -275,7 +275,7 @@
         <w:pStyle w:val="Heading1"/>
       </w:pPr>
       <w:bookmarkStart w:id="0" w:name="_Toc220478419"/>
-      <w:bookmarkStart w:id="1" w:name="_Toc225111864"/>
+      <w:bookmarkStart w:id="1" w:name="_Toc225879282"/>
       <w:r>
         <w:t>Declaration of Authenticity</w:t>
       </w:r>
@@ -336,7 +336,7 @@
         <w:pStyle w:val="Heading1"/>
       </w:pPr>
       <w:bookmarkStart w:id="2" w:name="_Toc220478420"/>
-      <w:bookmarkStart w:id="3" w:name="_Toc225111865"/>
+      <w:bookmarkStart w:id="3" w:name="_Toc225879283"/>
       <w:r>
         <w:t>Ackn</w:t>
       </w:r>
@@ -731,7 +731,7 @@
           <w:r>
             <w:fldChar w:fldCharType="separate"/>
           </w:r>
-          <w:hyperlink w:anchor="_Toc225111864" w:history="1">
+          <w:hyperlink w:anchor="_Toc225879282" w:history="1">
             <w:r>
               <w:rPr>
                 <w:rStyle w:val="Hyperlink"/>
@@ -758,7 +758,7 @@
                 <w:noProof/>
                 <w:webHidden/>
               </w:rPr>
-              <w:instrText xml:space="preserve"> PAGEREF _Toc225111864 \h </w:instrText>
+              <w:instrText xml:space="preserve"> PAGEREF _Toc225879282 \h </w:instrText>
             </w:r>
             <w:r>
               <w:rPr>
@@ -805,7 +805,7 @@
               <w14:ligatures w14:val="standardContextual"/>
             </w:rPr>
           </w:pPr>
-          <w:hyperlink w:anchor="_Toc225111865" w:history="1">
+          <w:hyperlink w:anchor="_Toc225879283" w:history="1">
             <w:r>
               <w:rPr>
                 <w:rStyle w:val="Hyperlink"/>
@@ -832,7 +832,7 @@
                 <w:noProof/>
                 <w:webHidden/>
               </w:rPr>
-              <w:instrText xml:space="preserve"> PAGEREF _Toc225111865 \h </w:instrText>
+              <w:instrText xml:space="preserve"> PAGEREF _Toc225879283 \h </w:instrText>
             </w:r>
             <w:r>
               <w:rPr>
@@ -879,7 +879,7 @@
               <w14:ligatures w14:val="standardContextual"/>
             </w:rPr>
           </w:pPr>
-          <w:hyperlink w:anchor="_Toc225111866" w:history="1">
+          <w:hyperlink w:anchor="_Toc225879284" w:history="1">
             <w:r>
               <w:rPr>
                 <w:rStyle w:val="Hyperlink"/>
@@ -906,7 +906,7 @@
                 <w:noProof/>
                 <w:webHidden/>
               </w:rPr>
-              <w:instrText xml:space="preserve"> PAGEREF _Toc225111866 \h </w:instrText>
+              <w:instrText xml:space="preserve"> PAGEREF _Toc225879284 \h </w:instrText>
             </w:r>
             <w:r>
               <w:rPr>
@@ -953,7 +953,7 @@
               <w14:ligatures w14:val="standardContextual"/>
             </w:rPr>
           </w:pPr>
-          <w:hyperlink w:anchor="_Toc225111867" w:history="1">
+          <w:hyperlink w:anchor="_Toc225879285" w:history="1">
             <w:r>
               <w:rPr>
                 <w:rStyle w:val="Hyperlink"/>
@@ -980,7 +980,7 @@
                 <w:noProof/>
                 <w:webHidden/>
               </w:rPr>
-              <w:instrText xml:space="preserve"> PAGEREF _Toc225111867 \h </w:instrText>
+              <w:instrText xml:space="preserve"> PAGEREF _Toc225879285 \h </w:instrText>
             </w:r>
             <w:r>
               <w:rPr>
@@ -1027,7 +1027,7 @@
               <w14:ligatures w14:val="standardContextual"/>
             </w:rPr>
           </w:pPr>
-          <w:hyperlink w:anchor="_Toc225111868" w:history="1">
+          <w:hyperlink w:anchor="_Toc225879286" w:history="1">
             <w:r>
               <w:rPr>
                 <w:rStyle w:val="Hyperlink"/>
@@ -1054,7 +1054,7 @@
                 <w:noProof/>
                 <w:webHidden/>
               </w:rPr>
-              <w:instrText xml:space="preserve"> PAGEREF _Toc225111868 \h </w:instrText>
+              <w:instrText xml:space="preserve"> PAGEREF _Toc225879286 \h </w:instrText>
             </w:r>
             <w:r>
               <w:rPr>
@@ -1101,7 +1101,7 @@
               <w14:ligatures w14:val="standardContextual"/>
             </w:rPr>
           </w:pPr>
-          <w:hyperlink w:anchor="_Toc225111869" w:history="1">
+          <w:hyperlink w:anchor="_Toc225879287" w:history="1">
             <w:r>
               <w:rPr>
                 <w:rStyle w:val="Hyperlink"/>
@@ -1128,7 +1128,7 @@
                 <w:noProof/>
                 <w:webHidden/>
               </w:rPr>
-              <w:instrText xml:space="preserve"> PAGEREF _Toc225111869 \h </w:instrText>
+              <w:instrText xml:space="preserve"> PAGEREF _Toc225879287 \h </w:instrText>
             </w:r>
             <w:r>
               <w:rPr>
@@ -1175,7 +1175,7 @@
               <w14:ligatures w14:val="standardContextual"/>
             </w:rPr>
           </w:pPr>
-          <w:hyperlink w:anchor="_Toc225111870" w:history="1">
+          <w:hyperlink w:anchor="_Toc225879288" w:history="1">
             <w:r>
               <w:rPr>
                 <w:rStyle w:val="Hyperlink"/>
@@ -1202,7 +1202,7 @@
                 <w:noProof/>
                 <w:webHidden/>
               </w:rPr>
-              <w:instrText xml:space="preserve"> PAGEREF _Toc225111870 \h </w:instrText>
+              <w:instrText xml:space="preserve"> PAGEREF _Toc225879288 \h </w:instrText>
             </w:r>
             <w:r>
               <w:rPr>
@@ -1249,7 +1249,7 @@
               <w14:ligatures w14:val="standardContextual"/>
             </w:rPr>
           </w:pPr>
-          <w:hyperlink w:anchor="_Toc225111871" w:history="1">
+          <w:hyperlink w:anchor="_Toc225879289" w:history="1">
             <w:r>
               <w:rPr>
                 <w:rStyle w:val="Hyperlink"/>
@@ -1276,7 +1276,7 @@
                 <w:noProof/>
                 <w:webHidden/>
               </w:rPr>
-              <w:instrText xml:space="preserve"> PAGEREF _Toc225111871 \h </w:instrText>
+              <w:instrText xml:space="preserve"> PAGEREF _Toc225879289 \h </w:instrText>
             </w:r>
             <w:r>
               <w:rPr>
@@ -1323,7 +1323,7 @@
               <w14:ligatures w14:val="standardContextual"/>
             </w:rPr>
           </w:pPr>
-          <w:hyperlink w:anchor="_Toc225111872" w:history="1">
+          <w:hyperlink w:anchor="_Toc225879290" w:history="1">
             <w:r>
               <w:rPr>
                 <w:rStyle w:val="Hyperlink"/>
@@ -1350,7 +1350,7 @@
                 <w:noProof/>
                 <w:webHidden/>
               </w:rPr>
-              <w:instrText xml:space="preserve"> PAGEREF _Toc225111872 \h </w:instrText>
+              <w:instrText xml:space="preserve"> PAGEREF _Toc225879290 \h </w:instrText>
             </w:r>
             <w:r>
               <w:rPr>
@@ -1397,7 +1397,7 @@
               <w14:ligatures w14:val="standardContextual"/>
             </w:rPr>
           </w:pPr>
-          <w:hyperlink w:anchor="_Toc225111873" w:history="1">
+          <w:hyperlink w:anchor="_Toc225879291" w:history="1">
             <w:r>
               <w:rPr>
                 <w:rStyle w:val="Hyperlink"/>
@@ -1424,7 +1424,7 @@
                 <w:noProof/>
                 <w:webHidden/>
               </w:rPr>
-              <w:instrText xml:space="preserve"> PAGEREF _Toc225111873 \h </w:instrText>
+              <w:instrText xml:space="preserve"> PAGEREF _Toc225879291 \h </w:instrText>
             </w:r>
             <w:r>
               <w:rPr>
@@ -1471,7 +1471,7 @@
               <w14:ligatures w14:val="standardContextual"/>
             </w:rPr>
           </w:pPr>
-          <w:hyperlink w:anchor="_Toc225111874" w:history="1">
+          <w:hyperlink w:anchor="_Toc225879292" w:history="1">
             <w:r>
               <w:rPr>
                 <w:rStyle w:val="Hyperlink"/>
@@ -1498,7 +1498,7 @@
                 <w:noProof/>
                 <w:webHidden/>
               </w:rPr>
-              <w:instrText xml:space="preserve"> PAGEREF _Toc225111874 \h </w:instrText>
+              <w:instrText xml:space="preserve"> PAGEREF _Toc225879292 \h </w:instrText>
             </w:r>
             <w:r>
               <w:rPr>
@@ -1545,7 +1545,7 @@
               <w14:ligatures w14:val="standardContextual"/>
             </w:rPr>
           </w:pPr>
-          <w:hyperlink w:anchor="_Toc225111875" w:history="1">
+          <w:hyperlink w:anchor="_Toc225879293" w:history="1">
             <w:r>
               <w:rPr>
                 <w:rStyle w:val="Hyperlink"/>
@@ -1572,7 +1572,7 @@
                 <w:noProof/>
                 <w:webHidden/>
               </w:rPr>
-              <w:instrText xml:space="preserve"> PAGEREF _Toc225111875 \h </w:instrText>
+              <w:instrText xml:space="preserve"> PAGEREF _Toc225879293 \h </w:instrText>
             </w:r>
             <w:r>
               <w:rPr>
@@ -1619,7 +1619,7 @@
               <w14:ligatures w14:val="standardContextual"/>
             </w:rPr>
           </w:pPr>
-          <w:hyperlink w:anchor="_Toc225111876" w:history="1">
+          <w:hyperlink w:anchor="_Toc225879294" w:history="1">
             <w:r>
               <w:rPr>
                 <w:rStyle w:val="Hyperlink"/>
@@ -1654,7 +1654,7 @@
                 <w:noProof/>
                 <w:webHidden/>
               </w:rPr>
-              <w:instrText xml:space="preserve"> PAGEREF _Toc225111876 \h </w:instrText>
+              <w:instrText xml:space="preserve"> PAGEREF _Toc225879294 \h </w:instrText>
             </w:r>
             <w:r>
               <w:rPr>
@@ -1701,7 +1701,7 @@
               <w14:ligatures w14:val="standardContextual"/>
             </w:rPr>
           </w:pPr>
-          <w:hyperlink w:anchor="_Toc225111877" w:history="1">
+          <w:hyperlink w:anchor="_Toc225879295" w:history="1">
             <w:r>
               <w:rPr>
                 <w:rStyle w:val="Hyperlink"/>
@@ -1728,7 +1728,7 @@
                 <w:noProof/>
                 <w:webHidden/>
               </w:rPr>
-              <w:instrText xml:space="preserve"> PAGEREF _Toc225111877 \h </w:instrText>
+              <w:instrText xml:space="preserve"> PAGEREF _Toc225879295 \h </w:instrText>
             </w:r>
             <w:r>
               <w:rPr>
@@ -1775,7 +1775,7 @@
               <w14:ligatures w14:val="standardContextual"/>
             </w:rPr>
           </w:pPr>
-          <w:hyperlink w:anchor="_Toc225111878" w:history="1">
+          <w:hyperlink w:anchor="_Toc225879296" w:history="1">
             <w:r>
               <w:rPr>
                 <w:rStyle w:val="Hyperlink"/>
@@ -1802,7 +1802,7 @@
                 <w:noProof/>
                 <w:webHidden/>
               </w:rPr>
-              <w:instrText xml:space="preserve"> PAGEREF _Toc225111878 \h </w:instrText>
+              <w:instrText xml:space="preserve"> PAGEREF _Toc225879296 \h </w:instrText>
             </w:r>
             <w:r>
               <w:rPr>
@@ -1849,7 +1849,7 @@
               <w14:ligatures w14:val="standardContextual"/>
             </w:rPr>
           </w:pPr>
-          <w:hyperlink w:anchor="_Toc225111879" w:history="1">
+          <w:hyperlink w:anchor="_Toc225879297" w:history="1">
             <w:r>
               <w:rPr>
                 <w:rStyle w:val="Hyperlink"/>
@@ -1876,7 +1876,7 @@
                 <w:noProof/>
                 <w:webHidden/>
               </w:rPr>
-              <w:instrText xml:space="preserve"> PAGEREF _Toc225111879 \h </w:instrText>
+              <w:instrText xml:space="preserve"> PAGEREF _Toc225879297 \h </w:instrText>
             </w:r>
             <w:r>
               <w:rPr>
@@ -1923,7 +1923,7 @@
               <w14:ligatures w14:val="standardContextual"/>
             </w:rPr>
           </w:pPr>
-          <w:hyperlink w:anchor="_Toc225111880" w:history="1">
+          <w:hyperlink w:anchor="_Toc225879298" w:history="1">
             <w:r>
               <w:rPr>
                 <w:rStyle w:val="Hyperlink"/>
@@ -1950,7 +1950,7 @@
                 <w:noProof/>
                 <w:webHidden/>
               </w:rPr>
-              <w:instrText xml:space="preserve"> PAGEREF _Toc225111880 \h </w:instrText>
+              <w:instrText xml:space="preserve"> PAGEREF _Toc225879298 \h </w:instrText>
             </w:r>
             <w:r>
               <w:rPr>
@@ -1997,7 +1997,7 @@
               <w14:ligatures w14:val="standardContextual"/>
             </w:rPr>
           </w:pPr>
-          <w:hyperlink w:anchor="_Toc225111881" w:history="1">
+          <w:hyperlink w:anchor="_Toc225879299" w:history="1">
             <w:r>
               <w:rPr>
                 <w:rStyle w:val="Hyperlink"/>
@@ -2024,7 +2024,7 @@
                 <w:noProof/>
                 <w:webHidden/>
               </w:rPr>
-              <w:instrText xml:space="preserve"> PAGEREF _Toc225111881 \h </w:instrText>
+              <w:instrText xml:space="preserve"> PAGEREF _Toc225879299 \h </w:instrText>
             </w:r>
             <w:r>
               <w:rPr>
@@ -2071,7 +2071,7 @@
               <w14:ligatures w14:val="standardContextual"/>
             </w:rPr>
           </w:pPr>
-          <w:hyperlink w:anchor="_Toc225111882" w:history="1">
+          <w:hyperlink w:anchor="_Toc225879300" w:history="1">
             <w:r>
               <w:rPr>
                 <w:rStyle w:val="Hyperlink"/>
@@ -2098,7 +2098,7 @@
                 <w:noProof/>
                 <w:webHidden/>
               </w:rPr>
-              <w:instrText xml:space="preserve"> PAGEREF _Toc225111882 \h </w:instrText>
+              <w:instrText xml:space="preserve"> PAGEREF _Toc225879300 \h </w:instrText>
             </w:r>
             <w:r>
               <w:rPr>
@@ -2145,7 +2145,7 @@
               <w14:ligatures w14:val="standardContextual"/>
             </w:rPr>
           </w:pPr>
-          <w:hyperlink w:anchor="_Toc225111883" w:history="1">
+          <w:hyperlink w:anchor="_Toc225879301" w:history="1">
             <w:r>
               <w:rPr>
                 <w:rStyle w:val="Hyperlink"/>
@@ -2172,7 +2172,7 @@
                 <w:noProof/>
                 <w:webHidden/>
               </w:rPr>
-              <w:instrText xml:space="preserve"> PAGEREF _Toc225111883 \h </w:instrText>
+              <w:instrText xml:space="preserve"> PAGEREF _Toc225879301 \h </w:instrText>
             </w:r>
             <w:r>
               <w:rPr>
@@ -2219,7 +2219,7 @@
               <w14:ligatures w14:val="standardContextual"/>
             </w:rPr>
           </w:pPr>
-          <w:hyperlink w:anchor="_Toc225111884" w:history="1">
+          <w:hyperlink w:anchor="_Toc225879302" w:history="1">
             <w:r>
               <w:rPr>
                 <w:rStyle w:val="Hyperlink"/>
@@ -2246,7 +2246,7 @@
                 <w:noProof/>
                 <w:webHidden/>
               </w:rPr>
-              <w:instrText xml:space="preserve"> PAGEREF _Toc225111884 \h </w:instrText>
+              <w:instrText xml:space="preserve"> PAGEREF _Toc225879302 \h </w:instrText>
             </w:r>
             <w:r>
               <w:rPr>
@@ -2293,7 +2293,7 @@
               <w14:ligatures w14:val="standardContextual"/>
             </w:rPr>
           </w:pPr>
-          <w:hyperlink w:anchor="_Toc225111885" w:history="1">
+          <w:hyperlink w:anchor="_Toc225879303" w:history="1">
             <w:r>
               <w:rPr>
                 <w:rStyle w:val="Hyperlink"/>
@@ -2320,7 +2320,7 @@
                 <w:noProof/>
                 <w:webHidden/>
               </w:rPr>
-              <w:instrText xml:space="preserve"> PAGEREF _Toc225111885 \h </w:instrText>
+              <w:instrText xml:space="preserve"> PAGEREF _Toc225879303 \h </w:instrText>
             </w:r>
             <w:r>
               <w:rPr>
@@ -2367,7 +2367,7 @@
               <w14:ligatures w14:val="standardContextual"/>
             </w:rPr>
           </w:pPr>
-          <w:hyperlink w:anchor="_Toc225111886" w:history="1">
+          <w:hyperlink w:anchor="_Toc225879304" w:history="1">
             <w:r>
               <w:rPr>
                 <w:rStyle w:val="Hyperlink"/>
@@ -2394,7 +2394,7 @@
                 <w:noProof/>
                 <w:webHidden/>
               </w:rPr>
-              <w:instrText xml:space="preserve"> PAGEREF _Toc225111886 \h </w:instrText>
+              <w:instrText xml:space="preserve"> PAGEREF _Toc225879304 \h </w:instrText>
             </w:r>
             <w:r>
               <w:rPr>
@@ -2441,7 +2441,7 @@
               <w14:ligatures w14:val="standardContextual"/>
             </w:rPr>
           </w:pPr>
-          <w:hyperlink w:anchor="_Toc225111887" w:history="1">
+          <w:hyperlink w:anchor="_Toc225879305" w:history="1">
             <w:r>
               <w:rPr>
                 <w:rStyle w:val="Hyperlink"/>
@@ -2468,7 +2468,7 @@
                 <w:noProof/>
                 <w:webHidden/>
               </w:rPr>
-              <w:instrText xml:space="preserve"> PAGEREF _Toc225111887 \h </w:instrText>
+              <w:instrText xml:space="preserve"> PAGEREF _Toc225879305 \h </w:instrText>
             </w:r>
             <w:r>
               <w:rPr>
@@ -2515,7 +2515,7 @@
               <w14:ligatures w14:val="standardContextual"/>
             </w:rPr>
           </w:pPr>
-          <w:hyperlink w:anchor="_Toc225111888" w:history="1">
+          <w:hyperlink w:anchor="_Toc225879306" w:history="1">
             <w:r>
               <w:rPr>
                 <w:rStyle w:val="Hyperlink"/>
@@ -2542,7 +2542,7 @@
                 <w:noProof/>
                 <w:webHidden/>
               </w:rPr>
-              <w:instrText xml:space="preserve"> PAGEREF _Toc225111888 \h </w:instrText>
+              <w:instrText xml:space="preserve"> PAGEREF _Toc225879306 \h </w:instrText>
             </w:r>
             <w:r>
               <w:rPr>
@@ -2589,7 +2589,7 @@
               <w14:ligatures w14:val="standardContextual"/>
             </w:rPr>
           </w:pPr>
-          <w:hyperlink w:anchor="_Toc225111889" w:history="1">
+          <w:hyperlink w:anchor="_Toc225879307" w:history="1">
             <w:r>
               <w:rPr>
                 <w:rStyle w:val="Hyperlink"/>
@@ -2616,7 +2616,7 @@
                 <w:noProof/>
                 <w:webHidden/>
               </w:rPr>
-              <w:instrText xml:space="preserve"> PAGEREF _Toc225111889 \h </w:instrText>
+              <w:instrText xml:space="preserve"> PAGEREF _Toc225879307 \h </w:instrText>
             </w:r>
             <w:r>
               <w:rPr>
@@ -2663,7 +2663,7 @@
               <w14:ligatures w14:val="standardContextual"/>
             </w:rPr>
           </w:pPr>
-          <w:hyperlink w:anchor="_Toc225111890" w:history="1">
+          <w:hyperlink w:anchor="_Toc225879308" w:history="1">
             <w:r>
               <w:rPr>
                 <w:rStyle w:val="Hyperlink"/>
@@ -2690,7 +2690,7 @@
                 <w:noProof/>
                 <w:webHidden/>
               </w:rPr>
-              <w:instrText xml:space="preserve"> PAGEREF _Toc225111890 \h </w:instrText>
+              <w:instrText xml:space="preserve"> PAGEREF _Toc225879308 \h </w:instrText>
             </w:r>
             <w:r>
               <w:rPr>
@@ -2737,7 +2737,7 @@
               <w14:ligatures w14:val="standardContextual"/>
             </w:rPr>
           </w:pPr>
-          <w:hyperlink w:anchor="_Toc225111891" w:history="1">
+          <w:hyperlink w:anchor="_Toc225879309" w:history="1">
             <w:r>
               <w:rPr>
                 <w:rStyle w:val="Hyperlink"/>
@@ -2764,7 +2764,7 @@
                 <w:noProof/>
                 <w:webHidden/>
               </w:rPr>
-              <w:instrText xml:space="preserve"> PAGEREF _Toc225111891 \h </w:instrText>
+              <w:instrText xml:space="preserve"> PAGEREF _Toc225879309 \h </w:instrText>
             </w:r>
             <w:r>
               <w:rPr>
@@ -2811,7 +2811,7 @@
               <w14:ligatures w14:val="standardContextual"/>
             </w:rPr>
           </w:pPr>
-          <w:hyperlink w:anchor="_Toc225111892" w:history="1">
+          <w:hyperlink w:anchor="_Toc225879310" w:history="1">
             <w:r>
               <w:rPr>
                 <w:rStyle w:val="Hyperlink"/>
@@ -2838,7 +2838,7 @@
                 <w:noProof/>
                 <w:webHidden/>
               </w:rPr>
-              <w:instrText xml:space="preserve"> PAGEREF _Toc225111892 \h </w:instrText>
+              <w:instrText xml:space="preserve"> PAGEREF _Toc225879310 \h </w:instrText>
             </w:r>
             <w:r>
               <w:rPr>
@@ -2885,7 +2885,7 @@
               <w14:ligatures w14:val="standardContextual"/>
             </w:rPr>
           </w:pPr>
-          <w:hyperlink w:anchor="_Toc225111893" w:history="1">
+          <w:hyperlink w:anchor="_Toc225879311" w:history="1">
             <w:r>
               <w:rPr>
                 <w:rStyle w:val="Hyperlink"/>
@@ -2912,7 +2912,7 @@
                 <w:noProof/>
                 <w:webHidden/>
               </w:rPr>
-              <w:instrText xml:space="preserve"> PAGEREF _Toc225111893 \h </w:instrText>
+              <w:instrText xml:space="preserve"> PAGEREF _Toc225879311 \h </w:instrText>
             </w:r>
             <w:r>
               <w:rPr>
@@ -2959,7 +2959,7 @@
               <w14:ligatures w14:val="standardContextual"/>
             </w:rPr>
           </w:pPr>
-          <w:hyperlink w:anchor="_Toc225111894" w:history="1">
+          <w:hyperlink w:anchor="_Toc225879312" w:history="1">
             <w:r>
               <w:rPr>
                 <w:rStyle w:val="Hyperlink"/>
@@ -2986,7 +2986,7 @@
                 <w:noProof/>
                 <w:webHidden/>
               </w:rPr>
-              <w:instrText xml:space="preserve"> PAGEREF _Toc225111894 \h </w:instrText>
+              <w:instrText xml:space="preserve"> PAGEREF _Toc225879312 \h </w:instrText>
             </w:r>
             <w:r>
               <w:rPr>
@@ -3033,7 +3033,7 @@
               <w14:ligatures w14:val="standardContextual"/>
             </w:rPr>
           </w:pPr>
-          <w:hyperlink w:anchor="_Toc225111895" w:history="1">
+          <w:hyperlink w:anchor="_Toc225879313" w:history="1">
             <w:r>
               <w:rPr>
                 <w:rStyle w:val="Hyperlink"/>
@@ -3060,7 +3060,7 @@
                 <w:noProof/>
                 <w:webHidden/>
               </w:rPr>
-              <w:instrText xml:space="preserve"> PAGEREF _Toc225111895 \h </w:instrText>
+              <w:instrText xml:space="preserve"> PAGEREF _Toc225879313 \h </w:instrText>
             </w:r>
             <w:r>
               <w:rPr>
@@ -3107,7 +3107,7 @@
               <w14:ligatures w14:val="standardContextual"/>
             </w:rPr>
           </w:pPr>
-          <w:hyperlink w:anchor="_Toc225111896" w:history="1">
+          <w:hyperlink w:anchor="_Toc225879314" w:history="1">
             <w:r>
               <w:rPr>
                 <w:rStyle w:val="Hyperlink"/>
@@ -3134,7 +3134,7 @@
                 <w:noProof/>
                 <w:webHidden/>
               </w:rPr>
-              <w:instrText xml:space="preserve"> PAGEREF _Toc225111896 \h </w:instrText>
+              <w:instrText xml:space="preserve"> PAGEREF _Toc225879314 \h </w:instrText>
             </w:r>
             <w:r>
               <w:rPr>
@@ -3181,7 +3181,7 @@
               <w14:ligatures w14:val="standardContextual"/>
             </w:rPr>
           </w:pPr>
-          <w:hyperlink w:anchor="_Toc225111897" w:history="1">
+          <w:hyperlink w:anchor="_Toc225879315" w:history="1">
             <w:r>
               <w:rPr>
                 <w:rStyle w:val="Hyperlink"/>
@@ -3208,7 +3208,7 @@
                 <w:noProof/>
                 <w:webHidden/>
               </w:rPr>
-              <w:instrText xml:space="preserve"> PAGEREF _Toc225111897 \h </w:instrText>
+              <w:instrText xml:space="preserve"> PAGEREF _Toc225879315 \h </w:instrText>
             </w:r>
             <w:r>
               <w:rPr>
@@ -3255,7 +3255,7 @@
               <w14:ligatures w14:val="standardContextual"/>
             </w:rPr>
           </w:pPr>
-          <w:hyperlink w:anchor="_Toc225111898" w:history="1">
+          <w:hyperlink w:anchor="_Toc225879316" w:history="1">
             <w:r>
               <w:rPr>
                 <w:rStyle w:val="Hyperlink"/>
@@ -3282,7 +3282,7 @@
                 <w:noProof/>
                 <w:webHidden/>
               </w:rPr>
-              <w:instrText xml:space="preserve"> PAGEREF _Toc225111898 \h </w:instrText>
+              <w:instrText xml:space="preserve"> PAGEREF _Toc225879316 \h </w:instrText>
             </w:r>
             <w:r>
               <w:rPr>
@@ -3329,7 +3329,7 @@
               <w14:ligatures w14:val="standardContextual"/>
             </w:rPr>
           </w:pPr>
-          <w:hyperlink w:anchor="_Toc225111899" w:history="1">
+          <w:hyperlink w:anchor="_Toc225879317" w:history="1">
             <w:r>
               <w:rPr>
                 <w:rStyle w:val="Hyperlink"/>
@@ -3356,7 +3356,7 @@
                 <w:noProof/>
                 <w:webHidden/>
               </w:rPr>
-              <w:instrText xml:space="preserve"> PAGEREF _Toc225111899 \h </w:instrText>
+              <w:instrText xml:space="preserve"> PAGEREF _Toc225879317 \h </w:instrText>
             </w:r>
             <w:r>
               <w:rPr>
@@ -3403,7 +3403,7 @@
               <w14:ligatures w14:val="standardContextual"/>
             </w:rPr>
           </w:pPr>
-          <w:hyperlink w:anchor="_Toc225111900" w:history="1">
+          <w:hyperlink w:anchor="_Toc225879318" w:history="1">
             <w:r>
               <w:rPr>
                 <w:rStyle w:val="Hyperlink"/>
@@ -3430,7 +3430,7 @@
                 <w:noProof/>
                 <w:webHidden/>
               </w:rPr>
-              <w:instrText xml:space="preserve"> PAGEREF _Toc225111900 \h </w:instrText>
+              <w:instrText xml:space="preserve"> PAGEREF _Toc225879318 \h </w:instrText>
             </w:r>
             <w:r>
               <w:rPr>
@@ -3477,7 +3477,7 @@
               <w14:ligatures w14:val="standardContextual"/>
             </w:rPr>
           </w:pPr>
-          <w:hyperlink w:anchor="_Toc225111901" w:history="1">
+          <w:hyperlink w:anchor="_Toc225879319" w:history="1">
             <w:r>
               <w:rPr>
                 <w:rStyle w:val="Hyperlink"/>
@@ -3504,7 +3504,7 @@
                 <w:noProof/>
                 <w:webHidden/>
               </w:rPr>
-              <w:instrText xml:space="preserve"> PAGEREF _Toc225111901 \h </w:instrText>
+              <w:instrText xml:space="preserve"> PAGEREF _Toc225879319 \h </w:instrText>
             </w:r>
             <w:r>
               <w:rPr>
@@ -3551,7 +3551,7 @@
               <w14:ligatures w14:val="standardContextual"/>
             </w:rPr>
           </w:pPr>
-          <w:hyperlink w:anchor="_Toc225111902" w:history="1">
+          <w:hyperlink w:anchor="_Toc225879320" w:history="1">
             <w:r>
               <w:rPr>
                 <w:rStyle w:val="Hyperlink"/>
@@ -3579,7 +3579,7 @@
                 <w:noProof/>
                 <w:webHidden/>
               </w:rPr>
-              <w:instrText xml:space="preserve"> PAGEREF _Toc225111902 \h </w:instrText>
+              <w:instrText xml:space="preserve"> PAGEREF _Toc225879320 \h </w:instrText>
             </w:r>
             <w:r>
               <w:rPr>
@@ -3626,7 +3626,7 @@
               <w14:ligatures w14:val="standardContextual"/>
             </w:rPr>
           </w:pPr>
-          <w:hyperlink w:anchor="_Toc225111903" w:history="1">
+          <w:hyperlink w:anchor="_Toc225879321" w:history="1">
             <w:r>
               <w:rPr>
                 <w:rStyle w:val="Hyperlink"/>
@@ -3654,7 +3654,7 @@
                 <w:noProof/>
                 <w:webHidden/>
               </w:rPr>
-              <w:instrText xml:space="preserve"> PAGEREF _Toc225111903 \h </w:instrText>
+              <w:instrText xml:space="preserve"> PAGEREF _Toc225879321 \h </w:instrText>
             </w:r>
             <w:r>
               <w:rPr>
@@ -3701,7 +3701,7 @@
               <w14:ligatures w14:val="standardContextual"/>
             </w:rPr>
           </w:pPr>
-          <w:hyperlink w:anchor="_Toc225111904" w:history="1">
+          <w:hyperlink w:anchor="_Toc225879322" w:history="1">
             <w:r>
               <w:rPr>
                 <w:rStyle w:val="Hyperlink"/>
@@ -3729,7 +3729,7 @@
                 <w:noProof/>
                 <w:webHidden/>
               </w:rPr>
-              <w:instrText xml:space="preserve"> PAGEREF _Toc225111904 \h </w:instrText>
+              <w:instrText xml:space="preserve"> PAGEREF _Toc225879322 \h </w:instrText>
             </w:r>
             <w:r>
               <w:rPr>
@@ -3776,7 +3776,7 @@
               <w14:ligatures w14:val="standardContextual"/>
             </w:rPr>
           </w:pPr>
-          <w:hyperlink w:anchor="_Toc225111905" w:history="1">
+          <w:hyperlink w:anchor="_Toc225879323" w:history="1">
             <w:r>
               <w:rPr>
                 <w:rStyle w:val="Hyperlink"/>
@@ -3804,7 +3804,7 @@
                 <w:noProof/>
                 <w:webHidden/>
               </w:rPr>
-              <w:instrText xml:space="preserve"> PAGEREF _Toc225111905 \h </w:instrText>
+              <w:instrText xml:space="preserve"> PAGEREF _Toc225879323 \h </w:instrText>
             </w:r>
             <w:r>
               <w:rPr>
@@ -3851,7 +3851,7 @@
               <w14:ligatures w14:val="standardContextual"/>
             </w:rPr>
           </w:pPr>
-          <w:hyperlink w:anchor="_Toc225111906" w:history="1">
+          <w:hyperlink w:anchor="_Toc225879324" w:history="1">
             <w:r>
               <w:rPr>
                 <w:rStyle w:val="Hyperlink"/>
@@ -3879,7 +3879,7 @@
                 <w:noProof/>
                 <w:webHidden/>
               </w:rPr>
-              <w:instrText xml:space="preserve"> PAGEREF _Toc225111906 \h </w:instrText>
+              <w:instrText xml:space="preserve"> PAGEREF _Toc225879324 \h </w:instrText>
             </w:r>
             <w:r>
               <w:rPr>
@@ -3926,7 +3926,7 @@
               <w14:ligatures w14:val="standardContextual"/>
             </w:rPr>
           </w:pPr>
-          <w:hyperlink w:anchor="_Toc225111907" w:history="1">
+          <w:hyperlink w:anchor="_Toc225879325" w:history="1">
             <w:r>
               <w:rPr>
                 <w:rStyle w:val="Hyperlink"/>
@@ -3954,7 +3954,7 @@
                 <w:noProof/>
                 <w:webHidden/>
               </w:rPr>
-              <w:instrText xml:space="preserve"> PAGEREF _Toc225111907 \h </w:instrText>
+              <w:instrText xml:space="preserve"> PAGEREF _Toc225879325 \h </w:instrText>
             </w:r>
             <w:r>
               <w:rPr>
@@ -4001,7 +4001,7 @@
               <w14:ligatures w14:val="standardContextual"/>
             </w:rPr>
           </w:pPr>
-          <w:hyperlink w:anchor="_Toc225111908" w:history="1">
+          <w:hyperlink w:anchor="_Toc225879326" w:history="1">
             <w:r>
               <w:rPr>
                 <w:rStyle w:val="Hyperlink"/>
@@ -4029,7 +4029,7 @@
                 <w:noProof/>
                 <w:webHidden/>
               </w:rPr>
-              <w:instrText xml:space="preserve"> PAGEREF _Toc225111908 \h </w:instrText>
+              <w:instrText xml:space="preserve"> PAGEREF _Toc225879326 \h </w:instrText>
             </w:r>
             <w:r>
               <w:rPr>
@@ -4076,7 +4076,7 @@
               <w14:ligatures w14:val="standardContextual"/>
             </w:rPr>
           </w:pPr>
-          <w:hyperlink w:anchor="_Toc225111909" w:history="1">
+          <w:hyperlink w:anchor="_Toc225879327" w:history="1">
             <w:r>
               <w:rPr>
                 <w:rStyle w:val="Hyperlink"/>
@@ -4104,7 +4104,7 @@
                 <w:noProof/>
                 <w:webHidden/>
               </w:rPr>
-              <w:instrText xml:space="preserve"> PAGEREF _Toc225111909 \h </w:instrText>
+              <w:instrText xml:space="preserve"> PAGEREF _Toc225879327 \h </w:instrText>
             </w:r>
             <w:r>
               <w:rPr>
@@ -4151,7 +4151,7 @@
               <w14:ligatures w14:val="standardContextual"/>
             </w:rPr>
           </w:pPr>
-          <w:hyperlink w:anchor="_Toc225111910" w:history="1">
+          <w:hyperlink w:anchor="_Toc225879328" w:history="1">
             <w:r>
               <w:rPr>
                 <w:rStyle w:val="Hyperlink"/>
@@ -4179,7 +4179,7 @@
                 <w:noProof/>
                 <w:webHidden/>
               </w:rPr>
-              <w:instrText xml:space="preserve"> PAGEREF _Toc225111910 \h </w:instrText>
+              <w:instrText xml:space="preserve"> PAGEREF _Toc225879328 \h </w:instrText>
             </w:r>
             <w:r>
               <w:rPr>
@@ -4226,7 +4226,7 @@
               <w14:ligatures w14:val="standardContextual"/>
             </w:rPr>
           </w:pPr>
-          <w:hyperlink w:anchor="_Toc225111911" w:history="1">
+          <w:hyperlink w:anchor="_Toc225879329" w:history="1">
             <w:r>
               <w:rPr>
                 <w:rStyle w:val="Hyperlink"/>
@@ -4254,7 +4254,7 @@
                 <w:noProof/>
                 <w:webHidden/>
               </w:rPr>
-              <w:instrText xml:space="preserve"> PAGEREF _Toc225111911 \h </w:instrText>
+              <w:instrText xml:space="preserve"> PAGEREF _Toc225879329 \h </w:instrText>
             </w:r>
             <w:r>
               <w:rPr>
@@ -4301,7 +4301,7 @@
               <w14:ligatures w14:val="standardContextual"/>
             </w:rPr>
           </w:pPr>
-          <w:hyperlink w:anchor="_Toc225111912" w:history="1">
+          <w:hyperlink w:anchor="_Toc225879330" w:history="1">
             <w:r>
               <w:rPr>
                 <w:rStyle w:val="Hyperlink"/>
@@ -4336,7 +4336,7 @@
                 <w:noProof/>
                 <w:webHidden/>
               </w:rPr>
-              <w:instrText xml:space="preserve"> PAGEREF _Toc225111912 \h </w:instrText>
+              <w:instrText xml:space="preserve"> PAGEREF _Toc225879330 \h </w:instrText>
             </w:r>
             <w:r>
               <w:rPr>
@@ -4383,7 +4383,7 @@
               <w14:ligatures w14:val="standardContextual"/>
             </w:rPr>
           </w:pPr>
-          <w:hyperlink w:anchor="_Toc225111913" w:history="1">
+          <w:hyperlink w:anchor="_Toc225879331" w:history="1">
             <w:r>
               <w:rPr>
                 <w:rStyle w:val="Hyperlink"/>
@@ -4418,7 +4418,7 @@
                 <w:noProof/>
                 <w:webHidden/>
               </w:rPr>
-              <w:instrText xml:space="preserve"> PAGEREF _Toc225111913 \h </w:instrText>
+              <w:instrText xml:space="preserve"> PAGEREF _Toc225879331 \h </w:instrText>
             </w:r>
             <w:r>
               <w:rPr>
@@ -4465,7 +4465,7 @@
               <w14:ligatures w14:val="standardContextual"/>
             </w:rPr>
           </w:pPr>
-          <w:hyperlink w:anchor="_Toc225111914" w:history="1">
+          <w:hyperlink w:anchor="_Toc225879332" w:history="1">
             <w:r>
               <w:rPr>
                 <w:rStyle w:val="Hyperlink"/>
@@ -4500,7 +4500,7 @@
                 <w:noProof/>
                 <w:webHidden/>
               </w:rPr>
-              <w:instrText xml:space="preserve"> PAGEREF _Toc225111914 \h </w:instrText>
+              <w:instrText xml:space="preserve"> PAGEREF _Toc225879332 \h </w:instrText>
             </w:r>
             <w:r>
               <w:rPr>
@@ -4547,7 +4547,7 @@
               <w14:ligatures w14:val="standardContextual"/>
             </w:rPr>
           </w:pPr>
-          <w:hyperlink w:anchor="_Toc225111915" w:history="1">
+          <w:hyperlink w:anchor="_Toc225879333" w:history="1">
             <w:r>
               <w:rPr>
                 <w:rStyle w:val="Hyperlink"/>
@@ -4582,7 +4582,7 @@
                 <w:noProof/>
                 <w:webHidden/>
               </w:rPr>
-              <w:instrText xml:space="preserve"> PAGEREF _Toc225111915 \h </w:instrText>
+              <w:instrText xml:space="preserve"> PAGEREF _Toc225879333 \h </w:instrText>
             </w:r>
             <w:r>
               <w:rPr>
@@ -4629,7 +4629,7 @@
               <w14:ligatures w14:val="standardContextual"/>
             </w:rPr>
           </w:pPr>
-          <w:hyperlink w:anchor="_Toc225111916" w:history="1">
+          <w:hyperlink w:anchor="_Toc225879334" w:history="1">
             <w:r>
               <w:rPr>
                 <w:rStyle w:val="Hyperlink"/>
@@ -4664,7 +4664,7 @@
                 <w:noProof/>
                 <w:webHidden/>
               </w:rPr>
-              <w:instrText xml:space="preserve"> PAGEREF _Toc225111916 \h </w:instrText>
+              <w:instrText xml:space="preserve"> PAGEREF _Toc225879334 \h </w:instrText>
             </w:r>
             <w:r>
               <w:rPr>
@@ -4711,7 +4711,7 @@
               <w14:ligatures w14:val="standardContextual"/>
             </w:rPr>
           </w:pPr>
-          <w:hyperlink w:anchor="_Toc225111917" w:history="1">
+          <w:hyperlink w:anchor="_Toc225879335" w:history="1">
             <w:r>
               <w:rPr>
                 <w:rStyle w:val="Hyperlink"/>
@@ -4746,7 +4746,7 @@
                 <w:noProof/>
                 <w:webHidden/>
               </w:rPr>
-              <w:instrText xml:space="preserve"> PAGEREF _Toc225111917 \h </w:instrText>
+              <w:instrText xml:space="preserve"> PAGEREF _Toc225879335 \h </w:instrText>
             </w:r>
             <w:r>
               <w:rPr>
@@ -4793,7 +4793,7 @@
               <w14:ligatures w14:val="standardContextual"/>
             </w:rPr>
           </w:pPr>
-          <w:hyperlink w:anchor="_Toc225111918" w:history="1">
+          <w:hyperlink w:anchor="_Toc225879336" w:history="1">
             <w:r>
               <w:rPr>
                 <w:rStyle w:val="Hyperlink"/>
@@ -4828,7 +4828,7 @@
                 <w:noProof/>
                 <w:webHidden/>
               </w:rPr>
-              <w:instrText xml:space="preserve"> PAGEREF _Toc225111918 \h </w:instrText>
+              <w:instrText xml:space="preserve"> PAGEREF _Toc225879336 \h </w:instrText>
             </w:r>
             <w:r>
               <w:rPr>
@@ -4875,7 +4875,7 @@
               <w14:ligatures w14:val="standardContextual"/>
             </w:rPr>
           </w:pPr>
-          <w:hyperlink w:anchor="_Toc225111919" w:history="1">
+          <w:hyperlink w:anchor="_Toc225879337" w:history="1">
             <w:r>
               <w:rPr>
                 <w:rStyle w:val="Hyperlink"/>
@@ -4910,7 +4910,7 @@
                 <w:noProof/>
                 <w:webHidden/>
               </w:rPr>
-              <w:instrText xml:space="preserve"> PAGEREF _Toc225111919 \h </w:instrText>
+              <w:instrText xml:space="preserve"> PAGEREF _Toc225879337 \h </w:instrText>
             </w:r>
             <w:r>
               <w:rPr>
@@ -4957,7 +4957,7 @@
               <w14:ligatures w14:val="standardContextual"/>
             </w:rPr>
           </w:pPr>
-          <w:hyperlink w:anchor="_Toc225111920" w:history="1">
+          <w:hyperlink w:anchor="_Toc225879338" w:history="1">
             <w:r>
               <w:rPr>
                 <w:rStyle w:val="Hyperlink"/>
@@ -4985,7 +4985,7 @@
                 <w:noProof/>
                 <w:webHidden/>
               </w:rPr>
-              <w:instrText xml:space="preserve"> PAGEREF _Toc225111920 \h </w:instrText>
+              <w:instrText xml:space="preserve"> PAGEREF _Toc225879338 \h </w:instrText>
             </w:r>
             <w:r>
               <w:rPr>
@@ -5032,7 +5032,7 @@
               <w14:ligatures w14:val="standardContextual"/>
             </w:rPr>
           </w:pPr>
-          <w:hyperlink w:anchor="_Toc225111921" w:history="1">
+          <w:hyperlink w:anchor="_Toc225879339" w:history="1">
             <w:r>
               <w:rPr>
                 <w:rStyle w:val="Hyperlink"/>
@@ -5060,7 +5060,7 @@
                 <w:noProof/>
                 <w:webHidden/>
               </w:rPr>
-              <w:instrText xml:space="preserve"> PAGEREF _Toc225111921 \h </w:instrText>
+              <w:instrText xml:space="preserve"> PAGEREF _Toc225879339 \h </w:instrText>
             </w:r>
             <w:r>
               <w:rPr>
@@ -5107,7 +5107,7 @@
               <w14:ligatures w14:val="standardContextual"/>
             </w:rPr>
           </w:pPr>
-          <w:hyperlink w:anchor="_Toc225111922" w:history="1">
+          <w:hyperlink w:anchor="_Toc225879340" w:history="1">
             <w:r>
               <w:rPr>
                 <w:rStyle w:val="Hyperlink"/>
@@ -5134,7 +5134,7 @@
                 <w:noProof/>
                 <w:webHidden/>
               </w:rPr>
-              <w:instrText xml:space="preserve"> PAGEREF _Toc225111922 \h </w:instrText>
+              <w:instrText xml:space="preserve"> PAGEREF _Toc225879340 \h </w:instrText>
             </w:r>
             <w:r>
               <w:rPr>
@@ -5181,7 +5181,7 @@
               <w14:ligatures w14:val="standardContextual"/>
             </w:rPr>
           </w:pPr>
-          <w:hyperlink w:anchor="_Toc225111923" w:history="1">
+          <w:hyperlink w:anchor="_Toc225879341" w:history="1">
             <w:r>
               <w:rPr>
                 <w:rStyle w:val="Hyperlink"/>
@@ -5208,7 +5208,7 @@
                 <w:noProof/>
                 <w:webHidden/>
               </w:rPr>
-              <w:instrText xml:space="preserve"> PAGEREF _Toc225111923 \h </w:instrText>
+              <w:instrText xml:space="preserve"> PAGEREF _Toc225879341 \h </w:instrText>
             </w:r>
             <w:r>
               <w:rPr>
@@ -5255,7 +5255,7 @@
               <w14:ligatures w14:val="standardContextual"/>
             </w:rPr>
           </w:pPr>
-          <w:hyperlink w:anchor="_Toc225111924" w:history="1">
+          <w:hyperlink w:anchor="_Toc225879342" w:history="1">
             <w:r>
               <w:rPr>
                 <w:rStyle w:val="Hyperlink"/>
@@ -5282,7 +5282,7 @@
                 <w:noProof/>
                 <w:webHidden/>
               </w:rPr>
-              <w:instrText xml:space="preserve"> PAGEREF _Toc225111924 \h </w:instrText>
+              <w:instrText xml:space="preserve"> PAGEREF _Toc225879342 \h </w:instrText>
             </w:r>
             <w:r>
               <w:rPr>
@@ -5329,7 +5329,7 @@
               <w14:ligatures w14:val="standardContextual"/>
             </w:rPr>
           </w:pPr>
-          <w:hyperlink w:anchor="_Toc225111925" w:history="1">
+          <w:hyperlink w:anchor="_Toc225879343" w:history="1">
             <w:r>
               <w:rPr>
                 <w:rStyle w:val="Hyperlink"/>
@@ -5356,7 +5356,7 @@
                 <w:noProof/>
                 <w:webHidden/>
               </w:rPr>
-              <w:instrText xml:space="preserve"> PAGEREF _Toc225111925 \h </w:instrText>
+              <w:instrText xml:space="preserve"> PAGEREF _Toc225879343 \h </w:instrText>
             </w:r>
             <w:r>
               <w:rPr>
@@ -5403,7 +5403,7 @@
               <w14:ligatures w14:val="standardContextual"/>
             </w:rPr>
           </w:pPr>
-          <w:hyperlink w:anchor="_Toc225111926" w:history="1">
+          <w:hyperlink w:anchor="_Toc225879344" w:history="1">
             <w:r>
               <w:rPr>
                 <w:rStyle w:val="Hyperlink"/>
@@ -5430,7 +5430,7 @@
                 <w:noProof/>
                 <w:webHidden/>
               </w:rPr>
-              <w:instrText xml:space="preserve"> PAGEREF _Toc225111926 \h </w:instrText>
+              <w:instrText xml:space="preserve"> PAGEREF _Toc225879344 \h </w:instrText>
             </w:r>
             <w:r>
               <w:rPr>
@@ -5477,7 +5477,7 @@
               <w14:ligatures w14:val="standardContextual"/>
             </w:rPr>
           </w:pPr>
-          <w:hyperlink w:anchor="_Toc225111927" w:history="1">
+          <w:hyperlink w:anchor="_Toc225879345" w:history="1">
             <w:r>
               <w:rPr>
                 <w:rStyle w:val="Hyperlink"/>
@@ -5504,7 +5504,7 @@
                 <w:noProof/>
                 <w:webHidden/>
               </w:rPr>
-              <w:instrText xml:space="preserve"> PAGEREF _Toc225111927 \h </w:instrText>
+              <w:instrText xml:space="preserve"> PAGEREF _Toc225879345 \h </w:instrText>
             </w:r>
             <w:r>
               <w:rPr>
@@ -5551,7 +5551,7 @@
               <w14:ligatures w14:val="standardContextual"/>
             </w:rPr>
           </w:pPr>
-          <w:hyperlink w:anchor="_Toc225111928" w:history="1">
+          <w:hyperlink w:anchor="_Toc225879346" w:history="1">
             <w:r>
               <w:rPr>
                 <w:rStyle w:val="Hyperlink"/>
@@ -5578,7 +5578,7 @@
                 <w:noProof/>
                 <w:webHidden/>
               </w:rPr>
-              <w:instrText xml:space="preserve"> PAGEREF _Toc225111928 \h </w:instrText>
+              <w:instrText xml:space="preserve"> PAGEREF _Toc225879346 \h </w:instrText>
             </w:r>
             <w:r>
               <w:rPr>
@@ -5625,7 +5625,7 @@
               <w14:ligatures w14:val="standardContextual"/>
             </w:rPr>
           </w:pPr>
-          <w:hyperlink w:anchor="_Toc225111929" w:history="1">
+          <w:hyperlink w:anchor="_Toc225879347" w:history="1">
             <w:r>
               <w:rPr>
                 <w:rStyle w:val="Hyperlink"/>
@@ -5652,7 +5652,7 @@
                 <w:noProof/>
                 <w:webHidden/>
               </w:rPr>
-              <w:instrText xml:space="preserve"> PAGEREF _Toc225111929 \h </w:instrText>
+              <w:instrText xml:space="preserve"> PAGEREF _Toc225879347 \h </w:instrText>
             </w:r>
             <w:r>
               <w:rPr>
@@ -5699,7 +5699,7 @@
               <w14:ligatures w14:val="standardContextual"/>
             </w:rPr>
           </w:pPr>
-          <w:hyperlink w:anchor="_Toc225111930" w:history="1">
+          <w:hyperlink w:anchor="_Toc225879348" w:history="1">
             <w:r>
               <w:rPr>
                 <w:rStyle w:val="Hyperlink"/>
@@ -5726,7 +5726,7 @@
                 <w:noProof/>
                 <w:webHidden/>
               </w:rPr>
-              <w:instrText xml:space="preserve"> PAGEREF _Toc225111930 \h </w:instrText>
+              <w:instrText xml:space="preserve"> PAGEREF _Toc225879348 \h </w:instrText>
             </w:r>
             <w:r>
               <w:rPr>
@@ -5773,7 +5773,7 @@
               <w14:ligatures w14:val="standardContextual"/>
             </w:rPr>
           </w:pPr>
-          <w:hyperlink w:anchor="_Toc225111931" w:history="1">
+          <w:hyperlink w:anchor="_Toc225879349" w:history="1">
             <w:r>
               <w:rPr>
                 <w:rStyle w:val="Hyperlink"/>
@@ -5800,7 +5800,7 @@
                 <w:noProof/>
                 <w:webHidden/>
               </w:rPr>
-              <w:instrText xml:space="preserve"> PAGEREF _Toc225111931 \h </w:instrText>
+              <w:instrText xml:space="preserve"> PAGEREF _Toc225879349 \h </w:instrText>
             </w:r>
             <w:r>
               <w:rPr>
@@ -5847,7 +5847,7 @@
               <w14:ligatures w14:val="standardContextual"/>
             </w:rPr>
           </w:pPr>
-          <w:hyperlink w:anchor="_Toc225111932" w:history="1">
+          <w:hyperlink w:anchor="_Toc225879350" w:history="1">
             <w:r>
               <w:rPr>
                 <w:rStyle w:val="Hyperlink"/>
@@ -5874,7 +5874,7 @@
                 <w:noProof/>
                 <w:webHidden/>
               </w:rPr>
-              <w:instrText xml:space="preserve"> PAGEREF _Toc225111932 \h </w:instrText>
+              <w:instrText xml:space="preserve"> PAGEREF _Toc225879350 \h </w:instrText>
             </w:r>
             <w:r>
               <w:rPr>
@@ -5921,7 +5921,7 @@
               <w14:ligatures w14:val="standardContextual"/>
             </w:rPr>
           </w:pPr>
-          <w:hyperlink w:anchor="_Toc225111933" w:history="1">
+          <w:hyperlink w:anchor="_Toc225879351" w:history="1">
             <w:r>
               <w:rPr>
                 <w:rStyle w:val="Hyperlink"/>
@@ -5948,7 +5948,7 @@
                 <w:noProof/>
                 <w:webHidden/>
               </w:rPr>
-              <w:instrText xml:space="preserve"> PAGEREF _Toc225111933 \h </w:instrText>
+              <w:instrText xml:space="preserve"> PAGEREF _Toc225879351 \h </w:instrText>
             </w:r>
             <w:r>
               <w:rPr>
@@ -5995,7 +5995,7 @@
               <w14:ligatures w14:val="standardContextual"/>
             </w:rPr>
           </w:pPr>
-          <w:hyperlink w:anchor="_Toc225111934" w:history="1">
+          <w:hyperlink w:anchor="_Toc225879352" w:history="1">
             <w:r>
               <w:rPr>
                 <w:rStyle w:val="Hyperlink"/>
@@ -6022,7 +6022,7 @@
                 <w:noProof/>
                 <w:webHidden/>
               </w:rPr>
-              <w:instrText xml:space="preserve"> PAGEREF _Toc225111934 \h </w:instrText>
+              <w:instrText xml:space="preserve"> PAGEREF _Toc225879352 \h </w:instrText>
             </w:r>
             <w:r>
               <w:rPr>
@@ -6069,7 +6069,7 @@
               <w14:ligatures w14:val="standardContextual"/>
             </w:rPr>
           </w:pPr>
-          <w:hyperlink w:anchor="_Toc225111935" w:history="1">
+          <w:hyperlink w:anchor="_Toc225879353" w:history="1">
             <w:r>
               <w:rPr>
                 <w:rStyle w:val="Hyperlink"/>
@@ -6096,7 +6096,7 @@
                 <w:noProof/>
                 <w:webHidden/>
               </w:rPr>
-              <w:instrText xml:space="preserve"> PAGEREF _Toc225111935 \h </w:instrText>
+              <w:instrText xml:space="preserve"> PAGEREF _Toc225879353 \h </w:instrText>
             </w:r>
             <w:r>
               <w:rPr>
@@ -6143,7 +6143,7 @@
               <w14:ligatures w14:val="standardContextual"/>
             </w:rPr>
           </w:pPr>
-          <w:hyperlink w:anchor="_Toc225111936" w:history="1">
+          <w:hyperlink w:anchor="_Toc225879354" w:history="1">
             <w:r>
               <w:rPr>
                 <w:rStyle w:val="Hyperlink"/>
@@ -6170,7 +6170,7 @@
                 <w:noProof/>
                 <w:webHidden/>
               </w:rPr>
-              <w:instrText xml:space="preserve"> PAGEREF _Toc225111936 \h </w:instrText>
+              <w:instrText xml:space="preserve"> PAGEREF _Toc225879354 \h </w:instrText>
             </w:r>
             <w:r>
               <w:rPr>
@@ -6217,13 +6217,13 @@
               <w14:ligatures w14:val="standardContextual"/>
             </w:rPr>
           </w:pPr>
-          <w:hyperlink w:anchor="_Toc225111937" w:history="1">
+          <w:hyperlink w:anchor="_Toc225879355" w:history="1">
             <w:r>
               <w:rPr>
                 <w:rStyle w:val="Hyperlink"/>
                 <w:noProof/>
               </w:rPr>
-              <w:t>10. Conclusion</w:t>
+              <w:t>10. Use of Artificial Intelligence (Appendix C)</w:t>
             </w:r>
             <w:r>
               <w:rPr>
@@ -6244,7 +6244,7 @@
                 <w:noProof/>
                 <w:webHidden/>
               </w:rPr>
-              <w:instrText xml:space="preserve"> PAGEREF _Toc225111937 \h </w:instrText>
+              <w:instrText xml:space="preserve"> PAGEREF _Toc225879355 \h </w:instrText>
             </w:r>
             <w:r>
               <w:rPr>
@@ -6291,13 +6291,13 @@
               <w14:ligatures w14:val="standardContextual"/>
             </w:rPr>
           </w:pPr>
-          <w:hyperlink w:anchor="_Toc225111938" w:history="1">
+          <w:hyperlink w:anchor="_Toc225879356" w:history="1">
             <w:r>
               <w:rPr>
                 <w:rStyle w:val="Hyperlink"/>
                 <w:noProof/>
               </w:rPr>
-              <w:t>References</w:t>
+              <w:t>11. Conclusion</w:t>
             </w:r>
             <w:r>
               <w:rPr>
@@ -6318,7 +6318,7 @@
                 <w:noProof/>
                 <w:webHidden/>
               </w:rPr>
-              <w:instrText xml:space="preserve"> PAGEREF _Toc225111938 \h </w:instrText>
+              <w:instrText xml:space="preserve"> PAGEREF _Toc225879356 \h </w:instrText>
             </w:r>
             <w:r>
               <w:rPr>
@@ -6365,13 +6365,13 @@
               <w14:ligatures w14:val="standardContextual"/>
             </w:rPr>
           </w:pPr>
-          <w:hyperlink w:anchor="_Toc225111939" w:history="1">
+          <w:hyperlink w:anchor="_Toc225879357" w:history="1">
             <w:r>
               <w:rPr>
                 <w:rStyle w:val="Hyperlink"/>
                 <w:noProof/>
               </w:rPr>
-              <w:t>Appendices</w:t>
+              <w:t>References</w:t>
             </w:r>
             <w:r>
               <w:rPr>
@@ -6392,7 +6392,7 @@
                 <w:noProof/>
                 <w:webHidden/>
               </w:rPr>
-              <w:instrText xml:space="preserve"> PAGEREF _Toc225111939 \h </w:instrText>
+              <w:instrText xml:space="preserve"> PAGEREF _Toc225879357 \h </w:instrText>
             </w:r>
             <w:r>
               <w:rPr>
@@ -6412,7 +6412,81 @@
                 <w:noProof/>
                 <w:webHidden/>
               </w:rPr>
-              <w:t>49</w:t>
+              <w:t>48</w:t>
+            </w:r>
+            <w:r>
+              <w:rPr>
+                <w:noProof/>
+                <w:webHidden/>
+              </w:rPr>
+              <w:fldChar w:fldCharType="end"/>
+            </w:r>
+          </w:hyperlink>
+        </w:p>
+        <w:p>
+          <w:pPr>
+            <w:pStyle w:val="TOC1"/>
+            <w:tabs>
+              <w:tab w:val="right" w:leader="dot" w:pos="9656"/>
+            </w:tabs>
+            <w:rPr>
+              <w:rFonts w:asciiTheme="minorHAnsi" w:hAnsiTheme="minorHAnsi"/>
+              <w:noProof/>
+              <w:kern w:val="2"/>
+              <w:sz w:val="24"/>
+              <w:szCs w:val="24"/>
+              <w:lang w:val="en-IE" w:eastAsia="en-IE"/>
+              <w14:ligatures w14:val="standardContextual"/>
+            </w:rPr>
+          </w:pPr>
+          <w:hyperlink w:anchor="_Toc225879358" w:history="1">
+            <w:r>
+              <w:rPr>
+                <w:rStyle w:val="Hyperlink"/>
+                <w:noProof/>
+              </w:rPr>
+              <w:t>Appendices</w:t>
+            </w:r>
+            <w:r>
+              <w:rPr>
+                <w:noProof/>
+                <w:webHidden/>
+              </w:rPr>
+              <w:tab/>
+            </w:r>
+            <w:r>
+              <w:rPr>
+                <w:noProof/>
+                <w:webHidden/>
+              </w:rPr>
+              <w:fldChar w:fldCharType="begin"/>
+            </w:r>
+            <w:r>
+              <w:rPr>
+                <w:noProof/>
+                <w:webHidden/>
+              </w:rPr>
+              <w:instrText xml:space="preserve"> PAGEREF _Toc225879358 \h </w:instrText>
+            </w:r>
+            <w:r>
+              <w:rPr>
+                <w:noProof/>
+                <w:webHidden/>
+              </w:rPr>
+            </w:r>
+            <w:r>
+              <w:rPr>
+                <w:noProof/>
+                <w:webHidden/>
+              </w:rPr>
+              <w:fldChar w:fldCharType="separate"/>
+            </w:r>
+            <w:r>
+              <w:rPr>
+                <w:noProof/>
+                <w:webHidden/>
+              </w:rPr>
+              <w:t>50</w:t>
             </w:r>
             <w:r>
               <w:rPr>
@@ -6450,7 +6524,6 @@
         <w:t>Table of Figures</w:t>
       </w:r>
     </w:p>
-    <w:bookmarkStart w:id="6" w:name="_Toc225111866"/>
     <w:p>
       <w:pPr>
         <w:pStyle w:val="TableofFigures"/>
@@ -10026,6 +10099,7 @@
         <w:lastRenderedPageBreak/>
         <w:fldChar w:fldCharType="end"/>
       </w:r>
+      <w:bookmarkStart w:id="6" w:name="_Toc225879284"/>
       <w:r>
         <w:t xml:space="preserve">1. </w:t>
       </w:r>
@@ -10168,7 +10242,7 @@
       <w:pPr>
         <w:pStyle w:val="Heading1"/>
       </w:pPr>
-      <w:bookmarkStart w:id="7" w:name="_Toc225111867"/>
+      <w:bookmarkStart w:id="7" w:name="_Toc225879285"/>
       <w:r>
         <w:t>2</w:t>
       </w:r>
@@ -10238,7 +10312,7 @@
         <w:pStyle w:val="Heading2"/>
       </w:pPr>
       <w:bookmarkStart w:id="8" w:name="_Toc220478427"/>
-      <w:bookmarkStart w:id="9" w:name="_Toc225111868"/>
+      <w:bookmarkStart w:id="9" w:name="_Toc225879286"/>
       <w:r>
         <w:t>2</w:t>
       </w:r>
@@ -10359,7 +10433,7 @@
         <w:pStyle w:val="Heading2"/>
       </w:pPr>
       <w:bookmarkStart w:id="10" w:name="_Toc220478428"/>
-      <w:bookmarkStart w:id="11" w:name="_Toc225111869"/>
+      <w:bookmarkStart w:id="11" w:name="_Toc225879287"/>
       <w:r>
         <w:t>2</w:t>
       </w:r>
@@ -10391,7 +10465,7 @@
         <w:pStyle w:val="Heading2"/>
       </w:pPr>
       <w:bookmarkStart w:id="12" w:name="_Toc220478429"/>
-      <w:bookmarkStart w:id="13" w:name="_Toc225111870"/>
+      <w:bookmarkStart w:id="13" w:name="_Toc225879288"/>
       <w:r>
         <w:t>2</w:t>
       </w:r>
@@ -10453,7 +10527,7 @@
         <w:pStyle w:val="Heading2"/>
       </w:pPr>
       <w:bookmarkStart w:id="14" w:name="_Toc220478430"/>
-      <w:bookmarkStart w:id="15" w:name="_Toc225111871"/>
+      <w:bookmarkStart w:id="15" w:name="_Toc225879289"/>
       <w:r>
         <w:lastRenderedPageBreak/>
         <w:t>2</w:t>
@@ -10631,7 +10705,7 @@
       <w:pPr>
         <w:pStyle w:val="Heading2"/>
       </w:pPr>
-      <w:bookmarkStart w:id="16" w:name="_Toc225111872"/>
+      <w:bookmarkStart w:id="16" w:name="_Toc225879290"/>
       <w:r>
         <w:t xml:space="preserve">2.5 </w:t>
       </w:r>
@@ -11034,7 +11108,7 @@
         <w:pStyle w:val="Heading1"/>
       </w:pPr>
       <w:bookmarkStart w:id="17" w:name="_Toc220478432"/>
-      <w:bookmarkStart w:id="18" w:name="_Toc225111873"/>
+      <w:bookmarkStart w:id="18" w:name="_Toc225879291"/>
       <w:r>
         <w:t>3. Re</w:t>
       </w:r>
@@ -11052,7 +11126,7 @@
         <w:pStyle w:val="Heading2"/>
       </w:pPr>
       <w:bookmarkStart w:id="19" w:name="_Toc220478441"/>
-      <w:bookmarkStart w:id="20" w:name="_Toc225111874"/>
+      <w:bookmarkStart w:id="20" w:name="_Toc225879292"/>
       <w:r>
         <w:t>3</w:t>
       </w:r>
@@ -11128,7 +11202,7 @@
         <w:pStyle w:val="Heading2"/>
       </w:pPr>
       <w:bookmarkStart w:id="21" w:name="_Toc220478442"/>
-      <w:bookmarkStart w:id="22" w:name="_Toc225111875"/>
+      <w:bookmarkStart w:id="22" w:name="_Toc225879293"/>
       <w:r>
         <w:lastRenderedPageBreak/>
         <w:t>3</w:t>
@@ -11214,7 +11288,7 @@
         </w:rPr>
       </w:pPr>
       <w:bookmarkStart w:id="23" w:name="_Toc220478433"/>
-      <w:bookmarkStart w:id="24" w:name="_Toc225111876"/>
+      <w:bookmarkStart w:id="24" w:name="_Toc225879294"/>
       <w:r>
         <w:t>3.</w:t>
       </w:r>
@@ -11590,7 +11664,7 @@
       <w:pPr>
         <w:pStyle w:val="Heading2"/>
       </w:pPr>
-      <w:bookmarkStart w:id="26" w:name="_Toc225111877"/>
+      <w:bookmarkStart w:id="26" w:name="_Toc225879295"/>
       <w:r>
         <w:lastRenderedPageBreak/>
         <w:t>3.</w:t>
@@ -11708,7 +11782,7 @@
         <w:pStyle w:val="Heading2"/>
       </w:pPr>
       <w:bookmarkStart w:id="27" w:name="_Toc220478438"/>
-      <w:bookmarkStart w:id="28" w:name="_Toc225111878"/>
+      <w:bookmarkStart w:id="28" w:name="_Toc225879296"/>
       <w:r>
         <w:t>3</w:t>
       </w:r>
@@ -11946,7 +12020,7 @@
       <w:pPr>
         <w:pStyle w:val="Heading2"/>
       </w:pPr>
-      <w:bookmarkStart w:id="30" w:name="_Toc225111879"/>
+      <w:bookmarkStart w:id="30" w:name="_Toc225879297"/>
       <w:r>
         <w:t>3.</w:t>
       </w:r>
@@ -12020,7 +12094,7 @@
         <w:pStyle w:val="Heading1"/>
       </w:pPr>
       <w:bookmarkStart w:id="31" w:name="_Toc220478444"/>
-      <w:bookmarkStart w:id="32" w:name="_Toc225111880"/>
+      <w:bookmarkStart w:id="32" w:name="_Toc225879298"/>
       <w:r>
         <w:lastRenderedPageBreak/>
         <w:t>4</w:t>
@@ -12042,7 +12116,7 @@
         <w:pStyle w:val="Heading2"/>
       </w:pPr>
       <w:bookmarkStart w:id="33" w:name="_Toc220478445"/>
-      <w:bookmarkStart w:id="34" w:name="_Toc225111881"/>
+      <w:bookmarkStart w:id="34" w:name="_Toc225879299"/>
       <w:r>
         <w:t>4</w:t>
       </w:r>
@@ -12116,7 +12190,7 @@
         <w:pStyle w:val="Heading2"/>
       </w:pPr>
       <w:bookmarkStart w:id="35" w:name="_Toc220478447"/>
-      <w:bookmarkStart w:id="36" w:name="_Toc225111882"/>
+      <w:bookmarkStart w:id="36" w:name="_Toc225879300"/>
       <w:r>
         <w:t>4</w:t>
       </w:r>
@@ -12265,7 +12339,7 @@
         <w:pStyle w:val="Heading1"/>
       </w:pPr>
       <w:bookmarkStart w:id="38" w:name="_Toc220478448"/>
-      <w:bookmarkStart w:id="39" w:name="_Toc225111883"/>
+      <w:bookmarkStart w:id="39" w:name="_Toc225879301"/>
       <w:r>
         <w:lastRenderedPageBreak/>
         <w:t>5</w:t>
@@ -12281,7 +12355,7 @@
         <w:pStyle w:val="Heading2"/>
       </w:pPr>
       <w:bookmarkStart w:id="40" w:name="_Toc220478449"/>
-      <w:bookmarkStart w:id="41" w:name="_Toc225111884"/>
+      <w:bookmarkStart w:id="41" w:name="_Toc225879302"/>
       <w:r>
         <w:t>5</w:t>
       </w:r>
@@ -13374,7 +13448,7 @@
         <w:pStyle w:val="Heading2"/>
       </w:pPr>
       <w:bookmarkStart w:id="44" w:name="_Toc220478450"/>
-      <w:bookmarkStart w:id="45" w:name="_Toc225111885"/>
+      <w:bookmarkStart w:id="45" w:name="_Toc225879303"/>
       <w:r>
         <w:lastRenderedPageBreak/>
         <w:t>5</w:t>
@@ -14357,7 +14431,7 @@
         <w:pStyle w:val="Heading2"/>
       </w:pPr>
       <w:bookmarkStart w:id="47" w:name="_Toc220478451"/>
-      <w:bookmarkStart w:id="48" w:name="_Toc225111886"/>
+      <w:bookmarkStart w:id="48" w:name="_Toc225879304"/>
       <w:r>
         <w:t>5</w:t>
       </w:r>
@@ -15048,7 +15122,7 @@
       <w:pPr>
         <w:pStyle w:val="Heading2"/>
       </w:pPr>
-      <w:bookmarkStart w:id="50" w:name="_Toc225111887"/>
+      <w:bookmarkStart w:id="50" w:name="_Toc225879305"/>
       <w:r>
         <w:lastRenderedPageBreak/>
         <w:t>5</w:t>
@@ -15227,7 +15301,7 @@
       <w:pPr>
         <w:pStyle w:val="Heading2"/>
       </w:pPr>
-      <w:bookmarkStart w:id="52" w:name="_Toc225111888"/>
+      <w:bookmarkStart w:id="52" w:name="_Toc225879306"/>
       <w:r>
         <w:t>5</w:t>
       </w:r>
@@ -15422,7 +15496,7 @@
       <w:pPr>
         <w:pStyle w:val="Heading2"/>
       </w:pPr>
-      <w:bookmarkStart w:id="55" w:name="_Toc225111889"/>
+      <w:bookmarkStart w:id="55" w:name="_Toc225879307"/>
       <w:r>
         <w:lastRenderedPageBreak/>
         <w:t>5</w:t>
@@ -15693,7 +15767,7 @@
       <w:pPr>
         <w:pStyle w:val="Heading2"/>
       </w:pPr>
-      <w:bookmarkStart w:id="58" w:name="_Toc225111890"/>
+      <w:bookmarkStart w:id="58" w:name="_Toc225879308"/>
       <w:r>
         <w:t>5</w:t>
       </w:r>
@@ -16099,7 +16173,7 @@
       <w:pPr>
         <w:pStyle w:val="Heading2"/>
       </w:pPr>
-      <w:bookmarkStart w:id="63" w:name="_Toc225111891"/>
+      <w:bookmarkStart w:id="63" w:name="_Toc225879309"/>
       <w:r>
         <w:lastRenderedPageBreak/>
         <w:t>5.3.</w:t>
@@ -16582,7 +16656,7 @@
       <w:pPr>
         <w:pStyle w:val="Heading2"/>
       </w:pPr>
-      <w:bookmarkStart w:id="68" w:name="_Toc225111892"/>
+      <w:bookmarkStart w:id="68" w:name="_Toc225879310"/>
       <w:r>
         <w:lastRenderedPageBreak/>
         <w:t>5.3.6 Element Management (</w:t>
@@ -16920,7 +16994,7 @@
       <w:pPr>
         <w:pStyle w:val="Heading2"/>
       </w:pPr>
-      <w:bookmarkStart w:id="72" w:name="_Toc225111893"/>
+      <w:bookmarkStart w:id="72" w:name="_Toc225879311"/>
       <w:r>
         <w:t>5.3.7 Company Management (</w:t>
       </w:r>
@@ -17046,7 +17120,7 @@
       <w:pPr>
         <w:pStyle w:val="Heading2"/>
       </w:pPr>
-      <w:bookmarkStart w:id="74" w:name="_Toc225111894"/>
+      <w:bookmarkStart w:id="74" w:name="_Toc225879312"/>
       <w:r>
         <w:lastRenderedPageBreak/>
         <w:t xml:space="preserve">5.3.8 </w:t>
@@ -17792,7 +17866,7 @@
       <w:pPr>
         <w:pStyle w:val="Heading2"/>
       </w:pPr>
-      <w:bookmarkStart w:id="81" w:name="_Toc225111895"/>
+      <w:bookmarkStart w:id="81" w:name="_Toc225879313"/>
       <w:r>
         <w:t>5.3.9 Processor Reports (</w:t>
       </w:r>
@@ -17979,7 +18053,7 @@
       <w:pPr>
         <w:pStyle w:val="Heading2"/>
       </w:pPr>
-      <w:bookmarkStart w:id="83" w:name="_Toc225111896"/>
+      <w:bookmarkStart w:id="83" w:name="_Toc225879314"/>
       <w:r>
         <w:lastRenderedPageBreak/>
         <w:t>5</w:t>
@@ -18101,7 +18175,7 @@
       <w:pPr>
         <w:pStyle w:val="Heading2"/>
       </w:pPr>
-      <w:bookmarkStart w:id="85" w:name="_Toc225111897"/>
+      <w:bookmarkStart w:id="85" w:name="_Toc225879315"/>
       <w:r>
         <w:t xml:space="preserve">5.3.11 </w:t>
       </w:r>
@@ -18284,7 +18358,7 @@
       <w:pPr>
         <w:pStyle w:val="Heading2"/>
       </w:pPr>
-      <w:bookmarkStart w:id="88" w:name="_Toc225111898"/>
+      <w:bookmarkStart w:id="88" w:name="_Toc225879316"/>
       <w:r>
         <w:lastRenderedPageBreak/>
         <w:t xml:space="preserve">5.3.12 Revenue </w:t>
@@ -18983,7 +19057,7 @@
       <w:pPr>
         <w:pStyle w:val="Heading2"/>
       </w:pPr>
-      <w:bookmarkStart w:id="96" w:name="_Toc225111899"/>
+      <w:bookmarkStart w:id="96" w:name="_Toc225879317"/>
       <w:r>
         <w:lastRenderedPageBreak/>
         <w:t>5</w:t>
@@ -19203,7 +19277,7 @@
         <w:pStyle w:val="Heading2"/>
       </w:pPr>
       <w:bookmarkStart w:id="99" w:name="_Toc220478452"/>
-      <w:bookmarkStart w:id="100" w:name="_Toc225111900"/>
+      <w:bookmarkStart w:id="100" w:name="_Toc225879318"/>
       <w:r>
         <w:lastRenderedPageBreak/>
         <w:t xml:space="preserve">5.3.14 Logout </w:t>
@@ -19396,7 +19470,7 @@
       <w:pPr>
         <w:pStyle w:val="Heading2"/>
       </w:pPr>
-      <w:bookmarkStart w:id="103" w:name="_Toc225111901"/>
+      <w:bookmarkStart w:id="103" w:name="_Toc225879319"/>
       <w:r>
         <w:t>5</w:t>
       </w:r>
@@ -19450,7 +19524,7 @@
       <w:pPr>
         <w:pStyle w:val="Heading1"/>
       </w:pPr>
-      <w:bookmarkStart w:id="104" w:name="_Toc225111902"/>
+      <w:bookmarkStart w:id="104" w:name="_Toc225879320"/>
       <w:r>
         <w:rPr>
           <w:lang w:val="en-IE"/>
@@ -19464,7 +19538,7 @@
       <w:pPr>
         <w:pStyle w:val="Heading2"/>
       </w:pPr>
-      <w:bookmarkStart w:id="105" w:name="_Toc225111903"/>
+      <w:bookmarkStart w:id="105" w:name="_Toc225879321"/>
       <w:r>
         <w:rPr>
           <w:lang w:val="en-IE"/>
@@ -19945,7 +20019,7 @@
           <w:lang w:val="en-IE"/>
         </w:rPr>
       </w:pPr>
-      <w:bookmarkStart w:id="106" w:name="_Toc225111904"/>
+      <w:bookmarkStart w:id="106" w:name="_Toc225879322"/>
       <w:r>
         <w:rPr>
           <w:lang w:val="en-IE"/>
@@ -20155,7 +20229,7 @@
           <w:lang w:val="en-IE"/>
         </w:rPr>
       </w:pPr>
-      <w:bookmarkStart w:id="107" w:name="_Toc225111905"/>
+      <w:bookmarkStart w:id="107" w:name="_Toc225879323"/>
       <w:r>
         <w:rPr>
           <w:lang w:val="en-IE"/>
@@ -20332,7 +20406,7 @@
       <w:pPr>
         <w:pStyle w:val="Heading2"/>
       </w:pPr>
-      <w:bookmarkStart w:id="108" w:name="_Toc225111906"/>
+      <w:bookmarkStart w:id="108" w:name="_Toc225879324"/>
       <w:r>
         <w:rPr>
           <w:lang w:val="en-IE"/>
@@ -20434,7 +20508,7 @@
       <w:pPr>
         <w:pStyle w:val="Heading2"/>
       </w:pPr>
-      <w:bookmarkStart w:id="109" w:name="_Toc225111907"/>
+      <w:bookmarkStart w:id="109" w:name="_Toc225879325"/>
       <w:r>
         <w:rPr>
           <w:lang w:val="en-IE"/>
@@ -20574,7 +20648,7 @@
       <w:pPr>
         <w:pStyle w:val="Heading2"/>
       </w:pPr>
-      <w:bookmarkStart w:id="110" w:name="_Toc225111908"/>
+      <w:bookmarkStart w:id="110" w:name="_Toc225879326"/>
       <w:r>
         <w:rPr>
           <w:lang w:val="en-IE"/>
@@ -20724,7 +20798,7 @@
       <w:pPr>
         <w:pStyle w:val="Heading2"/>
       </w:pPr>
-      <w:bookmarkStart w:id="111" w:name="_Toc225111909"/>
+      <w:bookmarkStart w:id="111" w:name="_Toc225879327"/>
       <w:r>
         <w:rPr>
           <w:lang w:val="en-IE"/>
@@ -20834,7 +20908,7 @@
       <w:pPr>
         <w:pStyle w:val="Heading2"/>
       </w:pPr>
-      <w:bookmarkStart w:id="112" w:name="_Toc225111910"/>
+      <w:bookmarkStart w:id="112" w:name="_Toc225879328"/>
       <w:r>
         <w:rPr>
           <w:lang w:val="en-IE"/>
@@ -20995,7 +21069,7 @@
       <w:pPr>
         <w:pStyle w:val="Heading2"/>
       </w:pPr>
-      <w:bookmarkStart w:id="113" w:name="_Toc225111911"/>
+      <w:bookmarkStart w:id="113" w:name="_Toc225879329"/>
       <w:r>
         <w:rPr>
           <w:lang w:val="en-IE"/>
@@ -21156,7 +21230,7 @@
       <w:pPr>
         <w:pStyle w:val="Heading2"/>
       </w:pPr>
-      <w:bookmarkStart w:id="114" w:name="_Toc225111912"/>
+      <w:bookmarkStart w:id="114" w:name="_Toc225879330"/>
       <w:r>
         <w:rPr>
           <w:lang w:val="en-IE"/>
@@ -21330,7 +21404,7 @@
       <w:pPr>
         <w:pStyle w:val="Heading2"/>
       </w:pPr>
-      <w:bookmarkStart w:id="115" w:name="_Toc225111913"/>
+      <w:bookmarkStart w:id="115" w:name="_Toc225879331"/>
       <w:r>
         <w:rPr>
           <w:lang w:val="en-IE"/>
@@ -21388,7 +21462,7 @@
       <w:pPr>
         <w:pStyle w:val="Heading2"/>
       </w:pPr>
-      <w:bookmarkStart w:id="116" w:name="_Toc225111914"/>
+      <w:bookmarkStart w:id="116" w:name="_Toc225879332"/>
       <w:r>
         <w:rPr>
           <w:lang w:val="en-IE"/>
@@ -21488,7 +21562,7 @@
       <w:pPr>
         <w:pStyle w:val="Heading2"/>
       </w:pPr>
-      <w:bookmarkStart w:id="117" w:name="_Toc225111915"/>
+      <w:bookmarkStart w:id="117" w:name="_Toc225879333"/>
       <w:r>
         <w:rPr>
           <w:lang w:val="en-IE"/>
@@ -23497,7 +23571,33 @@
         <w:rPr>
           <w:lang w:val="en-IE"/>
         </w:rPr>
-        <w:t>Initial triage included:</w:t>
+        <w:t>Initial triage included</w:t>
+      </w:r>
+      <w:r>
+        <w:rPr>
+          <w:rFonts w:ascii="Arial" w:hAnsi="Arial" w:cs="Arial"/>
+          <w:color w:val="001D35"/>
+          <w:shd w:val="clear" w:color="auto" w:fill="FFFFFF"/>
+        </w:rPr>
+        <w:t xml:space="preserve"> </w:t>
+      </w:r>
+      <w:r>
+        <w:t>(OpenAI</w:t>
+      </w:r>
+      <w:r>
+        <w:t xml:space="preserve">, </w:t>
+      </w:r>
+      <w:r>
+        <w:t>2026</w:t>
+      </w:r>
+      <w:r>
+        <w:t>)</w:t>
+      </w:r>
+      <w:r>
+        <w:rPr>
+          <w:lang w:val="en-IE"/>
+        </w:rPr>
+        <w:t>:</w:t>
       </w:r>
     </w:p>
     <w:p>
@@ -24082,7 +24182,7 @@
       <w:pPr>
         <w:pStyle w:val="Heading2"/>
       </w:pPr>
-      <w:bookmarkStart w:id="119" w:name="_Toc225111916"/>
+      <w:bookmarkStart w:id="119" w:name="_Toc225879334"/>
       <w:r>
         <w:rPr>
           <w:lang w:val="en-IE"/>
@@ -24953,7 +25053,7 @@
       <w:pPr>
         <w:pStyle w:val="Heading2"/>
       </w:pPr>
-      <w:bookmarkStart w:id="120" w:name="_Toc225111917"/>
+      <w:bookmarkStart w:id="120" w:name="_Toc225879335"/>
       <w:r>
         <w:rPr>
           <w:lang w:val="en-IE"/>
@@ -25263,7 +25363,7 @@
       <w:pPr>
         <w:pStyle w:val="Heading2"/>
       </w:pPr>
-      <w:bookmarkStart w:id="121" w:name="_Toc225111918"/>
+      <w:bookmarkStart w:id="121" w:name="_Toc225879336"/>
       <w:r>
         <w:rPr>
           <w:lang w:val="en-IE"/>
@@ -25797,7 +25897,7 @@
       <w:pPr>
         <w:pStyle w:val="Heading2"/>
       </w:pPr>
-      <w:bookmarkStart w:id="122" w:name="_Toc225111919"/>
+      <w:bookmarkStart w:id="122" w:name="_Toc225879337"/>
       <w:r>
         <w:rPr>
           <w:lang w:val="en-IE"/>
@@ -26392,7 +26492,7 @@
       <w:pPr>
         <w:pStyle w:val="Heading2"/>
       </w:pPr>
-      <w:bookmarkStart w:id="123" w:name="_Toc225111920"/>
+      <w:bookmarkStart w:id="123" w:name="_Toc225879338"/>
       <w:r>
         <w:rPr>
           <w:lang w:val="en-IE"/>
@@ -26808,7 +26908,7 @@
       <w:pPr>
         <w:pStyle w:val="Heading2"/>
       </w:pPr>
-      <w:bookmarkStart w:id="124" w:name="_Toc225111921"/>
+      <w:bookmarkStart w:id="124" w:name="_Toc225879339"/>
       <w:r>
         <w:rPr>
           <w:lang w:val="en-IE"/>
@@ -27483,7 +27583,7 @@
         <w:pStyle w:val="Heading1"/>
       </w:pPr>
       <w:bookmarkStart w:id="125" w:name="_Toc220478462"/>
-      <w:bookmarkStart w:id="126" w:name="_Toc225111922"/>
+      <w:bookmarkStart w:id="126" w:name="_Toc225879340"/>
       <w:r>
         <w:lastRenderedPageBreak/>
         <w:t>7</w:t>
@@ -27499,7 +27599,7 @@
         <w:pStyle w:val="Heading2"/>
       </w:pPr>
       <w:bookmarkStart w:id="127" w:name="_Toc220478463"/>
-      <w:bookmarkStart w:id="128" w:name="_Toc225111923"/>
+      <w:bookmarkStart w:id="128" w:name="_Toc225879341"/>
       <w:r>
         <w:t>7</w:t>
       </w:r>
@@ -27589,7 +27689,7 @@
         <w:pStyle w:val="Heading2"/>
       </w:pPr>
       <w:bookmarkStart w:id="129" w:name="_Toc220478464"/>
-      <w:bookmarkStart w:id="130" w:name="_Toc225111924"/>
+      <w:bookmarkStart w:id="130" w:name="_Toc225879342"/>
       <w:r>
         <w:t>7</w:t>
       </w:r>
@@ -28128,7 +28228,7 @@
         <w:pStyle w:val="Heading1"/>
       </w:pPr>
       <w:bookmarkStart w:id="131" w:name="_Toc220478465"/>
-      <w:bookmarkStart w:id="132" w:name="_Toc225111925"/>
+      <w:bookmarkStart w:id="132" w:name="_Toc225879343"/>
       <w:r>
         <w:t>8</w:t>
       </w:r>
@@ -28281,7 +28381,7 @@
         <w:pStyle w:val="Heading1"/>
       </w:pPr>
       <w:bookmarkStart w:id="133" w:name="_Toc220478467"/>
-      <w:bookmarkStart w:id="134" w:name="_Toc225111926"/>
+      <w:bookmarkStart w:id="134" w:name="_Toc225879344"/>
       <w:r>
         <w:lastRenderedPageBreak/>
         <w:t>9</w:t>
@@ -28303,7 +28403,7 @@
         <w:pStyle w:val="Heading2"/>
       </w:pPr>
       <w:bookmarkStart w:id="135" w:name="_Toc220478468"/>
-      <w:bookmarkStart w:id="136" w:name="_Toc225111927"/>
+      <w:bookmarkStart w:id="136" w:name="_Toc225879345"/>
       <w:r>
         <w:t>9</w:t>
       </w:r>
@@ -28335,7 +28435,7 @@
         <w:pStyle w:val="Heading2"/>
       </w:pPr>
       <w:bookmarkStart w:id="137" w:name="_Toc220478469"/>
-      <w:bookmarkStart w:id="138" w:name="_Toc225111928"/>
+      <w:bookmarkStart w:id="138" w:name="_Toc225879346"/>
       <w:r>
         <w:t>9</w:t>
       </w:r>
@@ -28361,7 +28461,7 @@
         <w:pStyle w:val="Heading2"/>
       </w:pPr>
       <w:bookmarkStart w:id="139" w:name="_Toc220478470"/>
-      <w:bookmarkStart w:id="140" w:name="_Toc225111929"/>
+      <w:bookmarkStart w:id="140" w:name="_Toc225879347"/>
       <w:r>
         <w:t xml:space="preserve">9.3 </w:t>
       </w:r>
@@ -28402,7 +28502,7 @@
       <w:pPr>
         <w:pStyle w:val="Heading2"/>
       </w:pPr>
-      <w:bookmarkStart w:id="142" w:name="_Toc225111930"/>
+      <w:bookmarkStart w:id="142" w:name="_Toc225879348"/>
       <w:r>
         <w:t xml:space="preserve">9.3.1 </w:t>
       </w:r>
@@ -28645,7 +28745,7 @@
       <w:pPr>
         <w:pStyle w:val="Heading2"/>
       </w:pPr>
-      <w:bookmarkStart w:id="143" w:name="_Toc225111931"/>
+      <w:bookmarkStart w:id="143" w:name="_Toc225879349"/>
       <w:r>
         <w:t xml:space="preserve">9.3.2 </w:t>
       </w:r>
@@ -28850,7 +28950,7 @@
       <w:pPr>
         <w:pStyle w:val="Heading2"/>
       </w:pPr>
-      <w:bookmarkStart w:id="144" w:name="_Toc225111932"/>
+      <w:bookmarkStart w:id="144" w:name="_Toc225879350"/>
       <w:r>
         <w:t xml:space="preserve">9.3.3 </w:t>
       </w:r>
@@ -29109,7 +29209,7 @@
       <w:pPr>
         <w:pStyle w:val="Heading2"/>
       </w:pPr>
-      <w:bookmarkStart w:id="145" w:name="_Toc225111933"/>
+      <w:bookmarkStart w:id="145" w:name="_Toc225879351"/>
       <w:r>
         <w:t xml:space="preserve">9.3.4 </w:t>
       </w:r>
@@ -29201,7 +29301,7 @@
       <w:pPr>
         <w:pStyle w:val="Heading2"/>
       </w:pPr>
-      <w:bookmarkStart w:id="146" w:name="_Toc225111934"/>
+      <w:bookmarkStart w:id="146" w:name="_Toc225879352"/>
       <w:r>
         <w:lastRenderedPageBreak/>
         <w:t xml:space="preserve">9.3.5 </w:t>
@@ -29294,7 +29394,7 @@
       <w:pPr>
         <w:pStyle w:val="Heading2"/>
       </w:pPr>
-      <w:bookmarkStart w:id="147" w:name="_Toc225111935"/>
+      <w:bookmarkStart w:id="147" w:name="_Toc225879353"/>
       <w:r>
         <w:t xml:space="preserve">9.4 </w:t>
       </w:r>
@@ -29502,7 +29602,7 @@
       <w:pPr>
         <w:pStyle w:val="Heading2"/>
       </w:pPr>
-      <w:bookmarkStart w:id="148" w:name="_Toc225111936"/>
+      <w:bookmarkStart w:id="148" w:name="_Toc225879354"/>
       <w:r>
         <w:t xml:space="preserve">9.5 </w:t>
       </w:r>
@@ -29552,19 +29652,709 @@
     <w:p>
       <w:pPr>
         <w:pStyle w:val="Heading1"/>
-      </w:pPr>
-      <w:bookmarkStart w:id="149" w:name="_Toc225111937"/>
+        <w:rPr>
+          <w:lang w:val="en-IE"/>
+        </w:rPr>
+      </w:pPr>
+      <w:bookmarkStart w:id="149" w:name="_Toc225879355"/>
+      <w:r>
+        <w:t>10. Use of Artificial Intelligence</w:t>
+      </w:r>
+      <w:r>
+        <w:t xml:space="preserve"> (Appendix C)</w:t>
+      </w:r>
+      <w:bookmarkEnd w:id="149"/>
+    </w:p>
+    <w:p>
+      <w:pPr>
+        <w:rPr>
+          <w:lang w:val="en-IE"/>
+        </w:rPr>
+      </w:pPr>
+      <w:r>
+        <w:rPr>
+          <w:lang w:val="en-IE"/>
+        </w:rPr>
+        <w:t xml:space="preserve">Artificial Intelligence (AI) </w:t>
+      </w:r>
+      <w:r>
+        <w:rPr>
+          <w:lang w:val="en-IE"/>
+        </w:rPr>
+        <w:t xml:space="preserve">was used as an assistive </w:t>
+      </w:r>
+      <w:r>
+        <w:rPr>
+          <w:lang w:val="en-IE"/>
+        </w:rPr>
+        <w:t xml:space="preserve">tool </w:t>
+      </w:r>
+      <w:r>
+        <w:rPr>
+          <w:lang w:val="en-IE"/>
+        </w:rPr>
+        <w:t>during this project</w:t>
+      </w:r>
+      <w:r>
+        <w:rPr>
+          <w:lang w:val="en-IE"/>
+        </w:rPr>
+        <w:t>.</w:t>
+      </w:r>
+    </w:p>
+    <w:p>
+      <w:pPr>
+        <w:rPr>
+          <w:b/>
+          <w:bCs/>
+          <w:lang w:val="en-IE"/>
+        </w:rPr>
+      </w:pPr>
+      <w:r>
+        <w:rPr>
+          <w:b/>
+          <w:bCs/>
+          <w:lang w:val="en-IE"/>
+        </w:rPr>
+        <w:t xml:space="preserve">Initial </w:t>
+      </w:r>
+      <w:r>
+        <w:rPr>
+          <w:b/>
+          <w:bCs/>
+          <w:lang w:val="en-IE"/>
+        </w:rPr>
+        <w:t>Research</w:t>
+      </w:r>
+    </w:p>
+    <w:p>
+      <w:pPr>
+        <w:rPr>
+          <w:lang w:val="en-IE"/>
+        </w:rPr>
+      </w:pPr>
+      <w:r>
+        <w:rPr>
+          <w:lang w:val="en-IE"/>
+        </w:rPr>
+        <w:t xml:space="preserve">AI </w:t>
+      </w:r>
+      <w:r>
+        <w:rPr>
+          <w:lang w:val="en-IE"/>
+        </w:rPr>
+        <w:t xml:space="preserve">was </w:t>
+      </w:r>
+      <w:r>
+        <w:rPr>
+          <w:lang w:val="en-IE"/>
+        </w:rPr>
+        <w:t xml:space="preserve">used </w:t>
+      </w:r>
+      <w:r>
+        <w:rPr>
+          <w:lang w:val="en-IE"/>
+        </w:rPr>
+        <w:t xml:space="preserve">in </w:t>
+      </w:r>
+      <w:r>
+        <w:rPr>
+          <w:lang w:val="en-IE"/>
+        </w:rPr>
+        <w:t xml:space="preserve">the initial research phase to </w:t>
+      </w:r>
+      <w:r>
+        <w:rPr>
+          <w:lang w:val="en-IE"/>
+        </w:rPr>
+        <w:t xml:space="preserve">aid with the </w:t>
+      </w:r>
+      <w:r>
+        <w:rPr>
+          <w:lang w:val="en-IE"/>
+        </w:rPr>
+        <w:t xml:space="preserve">understanding </w:t>
+      </w:r>
+      <w:r>
+        <w:rPr>
+          <w:lang w:val="en-IE"/>
+        </w:rPr>
+        <w:t xml:space="preserve">of </w:t>
+      </w:r>
+      <w:r>
+        <w:rPr>
+          <w:lang w:val="en-IE"/>
+        </w:rPr>
+        <w:t>ROS API</w:t>
+      </w:r>
+      <w:r>
+        <w:rPr>
+          <w:lang w:val="en-IE"/>
+        </w:rPr>
+        <w:t xml:space="preserve"> requirements</w:t>
+      </w:r>
+      <w:r>
+        <w:rPr>
+          <w:lang w:val="en-IE"/>
+        </w:rPr>
+        <w:t xml:space="preserve"> and Revenue Swagger documents</w:t>
+      </w:r>
+      <w:r>
+        <w:rPr>
+          <w:lang w:val="en-IE"/>
+        </w:rPr>
+        <w:t xml:space="preserve">. This included </w:t>
+      </w:r>
+      <w:r>
+        <w:rPr>
+          <w:lang w:val="en-IE"/>
+        </w:rPr>
+        <w:t xml:space="preserve">summarising </w:t>
+      </w:r>
+      <w:r>
+        <w:rPr>
+          <w:lang w:val="en-IE"/>
+        </w:rPr>
+        <w:t xml:space="preserve">technical </w:t>
+      </w:r>
+      <w:r>
+        <w:rPr>
+          <w:lang w:val="en-IE"/>
+        </w:rPr>
+        <w:t>documents into a more user</w:t>
+      </w:r>
+      <w:r>
+        <w:rPr>
+          <w:lang w:val="en-IE"/>
+        </w:rPr>
+        <w:t>-</w:t>
+      </w:r>
+      <w:r>
+        <w:rPr>
+          <w:lang w:val="en-IE"/>
+        </w:rPr>
+        <w:t xml:space="preserve">friendly </w:t>
+      </w:r>
+      <w:r>
+        <w:rPr>
+          <w:lang w:val="en-IE"/>
+        </w:rPr>
+        <w:t>manner</w:t>
+      </w:r>
+      <w:r>
+        <w:rPr>
+          <w:lang w:val="en-IE"/>
+        </w:rPr>
+        <w:t xml:space="preserve"> and gaining an initial overview of technical </w:t>
+      </w:r>
+      <w:r>
+        <w:rPr>
+          <w:lang w:val="en-IE"/>
+        </w:rPr>
+        <w:t>specifications.</w:t>
+      </w:r>
+    </w:p>
+    <w:p>
+      <w:pPr>
+        <w:rPr>
+          <w:b/>
+          <w:bCs/>
+          <w:lang w:val="en-IE"/>
+        </w:rPr>
+      </w:pPr>
+      <w:r>
+        <w:rPr>
+          <w:b/>
+          <w:bCs/>
+          <w:lang w:val="en-IE"/>
+        </w:rPr>
+        <w:t>Code Comprehension and Data Flow Analysis</w:t>
+      </w:r>
+    </w:p>
+    <w:p>
+      <w:pPr>
+        <w:rPr>
+          <w:lang w:val="en-IE"/>
+        </w:rPr>
+      </w:pPr>
+      <w:r>
+        <w:rPr>
+          <w:lang w:val="en-IE"/>
+        </w:rPr>
+        <w:t xml:space="preserve">AI was used to </w:t>
+      </w:r>
+      <w:r>
+        <w:rPr>
+          <w:lang w:val="en-IE"/>
+        </w:rPr>
+        <w:t>interpret</w:t>
+      </w:r>
+      <w:r>
+        <w:rPr>
+          <w:lang w:val="en-IE"/>
+        </w:rPr>
+        <w:t xml:space="preserve"> code provided </w:t>
+      </w:r>
+      <w:r>
+        <w:rPr>
+          <w:lang w:val="en-IE"/>
+        </w:rPr>
+        <w:t>by work colleagues</w:t>
+      </w:r>
+      <w:r>
+        <w:rPr>
+          <w:lang w:val="en-IE"/>
+        </w:rPr>
+        <w:t xml:space="preserve">. This included analysing </w:t>
+      </w:r>
+      <w:r>
+        <w:rPr>
+          <w:lang w:val="en-IE"/>
+        </w:rPr>
+        <w:t xml:space="preserve">SQL SPROCs regarding </w:t>
+      </w:r>
+      <w:r>
+        <w:rPr>
+          <w:lang w:val="en-IE"/>
+        </w:rPr>
+        <w:t xml:space="preserve">data flow and </w:t>
+      </w:r>
+      <w:r>
+        <w:rPr>
+          <w:lang w:val="en-IE"/>
+        </w:rPr>
+        <w:t>data compilation</w:t>
+      </w:r>
+      <w:r>
+        <w:rPr>
+          <w:lang w:val="en-IE"/>
+        </w:rPr>
+        <w:t xml:space="preserve">. </w:t>
+      </w:r>
+      <w:r>
+        <w:rPr>
+          <w:lang w:val="en-IE"/>
+        </w:rPr>
+        <w:t>AI</w:t>
+      </w:r>
+      <w:r>
+        <w:rPr>
+          <w:lang w:val="en-IE"/>
+        </w:rPr>
+        <w:t xml:space="preserve"> assisted in breaking down complex </w:t>
+      </w:r>
+      <w:r>
+        <w:rPr>
+          <w:lang w:val="en-IE"/>
+        </w:rPr>
+        <w:t>data flows</w:t>
+      </w:r>
+      <w:r>
+        <w:rPr>
+          <w:lang w:val="en-IE"/>
+        </w:rPr>
+        <w:t xml:space="preserve"> into understandable components.</w:t>
+      </w:r>
+    </w:p>
+    <w:p>
+      <w:pPr>
+        <w:rPr>
+          <w:b/>
+          <w:bCs/>
+          <w:lang w:val="en-IE"/>
+        </w:rPr>
+      </w:pPr>
+      <w:r>
+        <w:rPr>
+          <w:b/>
+          <w:bCs/>
+          <w:lang w:val="en-IE"/>
+        </w:rPr>
+        <w:t>Debugging and Problem Resolution</w:t>
+      </w:r>
+    </w:p>
+    <w:p>
+      <w:pPr>
+        <w:rPr>
+          <w:lang w:val="en-IE"/>
+        </w:rPr>
+      </w:pPr>
+      <w:r>
+        <w:rPr>
+          <w:lang w:val="en-IE"/>
+        </w:rPr>
+        <w:t xml:space="preserve">AI </w:t>
+      </w:r>
+      <w:r>
+        <w:rPr>
+          <w:lang w:val="en-IE"/>
+        </w:rPr>
+        <w:t>was</w:t>
+      </w:r>
+      <w:r>
+        <w:rPr>
+          <w:lang w:val="en-IE"/>
+        </w:rPr>
+        <w:t xml:space="preserve"> used as a supplementary debugging </w:t>
+      </w:r>
+      <w:r>
+        <w:rPr>
+          <w:lang w:val="en-IE"/>
+        </w:rPr>
+        <w:t>tool</w:t>
+      </w:r>
+      <w:r>
+        <w:rPr>
+          <w:lang w:val="en-IE"/>
+        </w:rPr>
+        <w:t xml:space="preserve"> to help identify potential causes of errors and </w:t>
+      </w:r>
+      <w:r>
+        <w:rPr>
+          <w:lang w:val="en-IE"/>
+        </w:rPr>
+        <w:t xml:space="preserve">for </w:t>
+      </w:r>
+      <w:r>
+        <w:rPr>
+          <w:lang w:val="en-IE"/>
+        </w:rPr>
+        <w:t>suggest</w:t>
+      </w:r>
+      <w:r>
+        <w:rPr>
+          <w:lang w:val="en-IE"/>
+        </w:rPr>
+        <w:t>ed</w:t>
+      </w:r>
+      <w:r>
+        <w:rPr>
+          <w:lang w:val="en-IE"/>
+        </w:rPr>
+        <w:t xml:space="preserve"> troubleshooting approaches. This included diagnosing </w:t>
+      </w:r>
+      <w:r>
+        <w:rPr>
+          <w:lang w:val="en-IE"/>
+        </w:rPr>
+        <w:t xml:space="preserve">the digest header </w:t>
+      </w:r>
+      <w:r>
+        <w:rPr>
+          <w:lang w:val="en-IE"/>
+        </w:rPr>
+        <w:t xml:space="preserve">issue </w:t>
+      </w:r>
+      <w:r>
+        <w:rPr>
+          <w:lang w:val="en-IE"/>
+        </w:rPr>
+        <w:t xml:space="preserve">experienced </w:t>
+      </w:r>
+      <w:r>
+        <w:rPr>
+          <w:lang w:val="en-IE"/>
+        </w:rPr>
+        <w:t xml:space="preserve">during </w:t>
+      </w:r>
+      <w:r>
+        <w:rPr>
+          <w:lang w:val="en-IE"/>
+        </w:rPr>
+        <w:t>section 6.13</w:t>
+      </w:r>
+      <w:r>
+        <w:rPr>
+          <w:lang w:val="en-IE"/>
+        </w:rPr>
+        <w:t>.</w:t>
+      </w:r>
+    </w:p>
+    <w:p>
+      <w:pPr>
+        <w:rPr>
+          <w:lang w:val="en-IE"/>
+        </w:rPr>
+      </w:pPr>
+    </w:p>
+    <w:p>
+      <w:pPr>
+        <w:rPr>
+          <w:lang w:val="en-IE"/>
+        </w:rPr>
+      </w:pPr>
+    </w:p>
+    <w:p>
+      <w:pPr>
+        <w:rPr>
+          <w:b/>
+          <w:bCs/>
+          <w:lang w:val="en-IE"/>
+        </w:rPr>
+      </w:pPr>
+      <w:r>
+        <w:rPr>
+          <w:b/>
+          <w:bCs/>
+          <w:lang w:val="en-IE"/>
+        </w:rPr>
+        <w:lastRenderedPageBreak/>
+        <w:t>Academic Writing and Documentation</w:t>
+      </w:r>
+    </w:p>
+    <w:p>
+      <w:pPr>
+        <w:rPr>
+          <w:lang w:val="en-IE"/>
+        </w:rPr>
+      </w:pPr>
+      <w:r>
+        <w:rPr>
+          <w:lang w:val="en-IE"/>
+        </w:rPr>
+        <w:t xml:space="preserve">AI was used to assist in </w:t>
+      </w:r>
+      <w:r>
+        <w:rPr>
+          <w:lang w:val="en-IE"/>
+        </w:rPr>
+        <w:t xml:space="preserve">the </w:t>
+      </w:r>
+      <w:r>
+        <w:rPr>
+          <w:lang w:val="en-IE"/>
+        </w:rPr>
+        <w:t>re</w:t>
+      </w:r>
+      <w:r>
+        <w:rPr>
+          <w:lang w:val="en-IE"/>
+        </w:rPr>
+        <w:t xml:space="preserve">wording of </w:t>
+      </w:r>
+      <w:r>
+        <w:rPr>
+          <w:lang w:val="en-IE"/>
+        </w:rPr>
+        <w:t xml:space="preserve">technical explanations into a </w:t>
+      </w:r>
+      <w:r>
+        <w:rPr>
+          <w:lang w:val="en-IE"/>
+        </w:rPr>
+        <w:t xml:space="preserve">more </w:t>
+      </w:r>
+      <w:r>
+        <w:rPr>
+          <w:lang w:val="en-IE"/>
+        </w:rPr>
+        <w:t xml:space="preserve">formal academic </w:t>
+      </w:r>
+      <w:r>
+        <w:rPr>
+          <w:lang w:val="en-IE"/>
+        </w:rPr>
+        <w:t>tone</w:t>
+      </w:r>
+      <w:r>
+        <w:rPr>
+          <w:lang w:val="en-IE"/>
+        </w:rPr>
+        <w:t xml:space="preserve">, </w:t>
+      </w:r>
+      <w:r>
+        <w:rPr>
+          <w:lang w:val="en-IE"/>
+        </w:rPr>
+        <w:t xml:space="preserve">while maintaining the original </w:t>
+      </w:r>
+      <w:r>
+        <w:rPr>
+          <w:lang w:val="en-IE"/>
+        </w:rPr>
+        <w:t>content</w:t>
+      </w:r>
+      <w:r>
+        <w:rPr>
+          <w:lang w:val="en-IE"/>
+        </w:rPr>
+        <w:t xml:space="preserve">. All final written material was </w:t>
+      </w:r>
+      <w:r>
+        <w:rPr>
+          <w:lang w:val="en-IE"/>
+        </w:rPr>
+        <w:t xml:space="preserve">composed </w:t>
+      </w:r>
+      <w:r>
+        <w:rPr>
+          <w:lang w:val="en-IE"/>
+        </w:rPr>
+        <w:t xml:space="preserve">by </w:t>
+      </w:r>
+      <w:proofErr w:type="gramStart"/>
+      <w:r>
+        <w:rPr>
+          <w:lang w:val="en-IE"/>
+        </w:rPr>
+        <w:t>m</w:t>
+      </w:r>
+      <w:r>
+        <w:rPr>
+          <w:lang w:val="en-IE"/>
+        </w:rPr>
+        <w:t>yself</w:t>
+      </w:r>
+      <w:proofErr w:type="gramEnd"/>
+      <w:r>
+        <w:rPr>
+          <w:lang w:val="en-IE"/>
+        </w:rPr>
+        <w:t xml:space="preserve">, </w:t>
+      </w:r>
+      <w:r>
+        <w:rPr>
+          <w:lang w:val="en-IE"/>
+        </w:rPr>
+        <w:t>ensur</w:t>
+      </w:r>
+      <w:r>
+        <w:rPr>
+          <w:lang w:val="en-IE"/>
+        </w:rPr>
+        <w:t>ing</w:t>
+      </w:r>
+      <w:r>
+        <w:rPr>
+          <w:lang w:val="en-IE"/>
+        </w:rPr>
+        <w:t xml:space="preserve"> </w:t>
+      </w:r>
+      <w:r>
+        <w:rPr>
+          <w:lang w:val="en-IE"/>
+        </w:rPr>
+        <w:t>authorship</w:t>
+      </w:r>
+      <w:r>
+        <w:rPr>
+          <w:lang w:val="en-IE"/>
+        </w:rPr>
+        <w:t>.</w:t>
+      </w:r>
+    </w:p>
+    <w:p>
+      <w:pPr>
+        <w:rPr>
+          <w:b/>
+          <w:bCs/>
+          <w:lang w:val="en-IE"/>
+        </w:rPr>
+      </w:pPr>
+      <w:r>
+        <w:rPr>
+          <w:b/>
+          <w:bCs/>
+          <w:lang w:val="en-IE"/>
+        </w:rPr>
+        <w:t>Ethical Considerations</w:t>
+      </w:r>
+    </w:p>
+    <w:p>
+      <w:pPr>
+        <w:rPr>
+          <w:lang w:val="en-IE"/>
+        </w:rPr>
+      </w:pPr>
+      <w:r>
+        <w:rPr>
+          <w:lang w:val="en-IE"/>
+        </w:rPr>
+        <w:t xml:space="preserve">I </w:t>
+      </w:r>
+      <w:r>
+        <w:rPr>
+          <w:lang w:val="en-IE"/>
+        </w:rPr>
+        <w:t xml:space="preserve">believe that the use of AI in this project </w:t>
+      </w:r>
+      <w:r>
+        <w:rPr>
+          <w:lang w:val="en-IE"/>
+        </w:rPr>
+        <w:t xml:space="preserve">adhered to academic guidelines. AI was </w:t>
+      </w:r>
+      <w:r>
+        <w:rPr>
+          <w:lang w:val="en-IE"/>
+        </w:rPr>
+        <w:t>used to assist learning and not to replace it. I</w:t>
+      </w:r>
+      <w:r>
+        <w:rPr>
+          <w:lang w:val="en-IE"/>
+        </w:rPr>
+        <w:t xml:space="preserve">ndependent </w:t>
+      </w:r>
+      <w:r>
+        <w:rPr>
+          <w:lang w:val="en-IE"/>
+        </w:rPr>
+        <w:t xml:space="preserve">learning and </w:t>
+      </w:r>
+      <w:r>
+        <w:rPr>
+          <w:lang w:val="en-IE"/>
+        </w:rPr>
+        <w:t>problem</w:t>
+      </w:r>
+      <w:r>
+        <w:rPr>
+          <w:lang w:val="en-IE"/>
+        </w:rPr>
+        <w:t xml:space="preserve"> </w:t>
+      </w:r>
+      <w:r>
+        <w:rPr>
+          <w:lang w:val="en-IE"/>
+        </w:rPr>
+        <w:t>solving</w:t>
+      </w:r>
+      <w:r>
+        <w:rPr>
+          <w:lang w:val="en-IE"/>
+        </w:rPr>
+        <w:t xml:space="preserve"> remained the </w:t>
+      </w:r>
+      <w:r>
+        <w:rPr>
+          <w:lang w:val="en-IE"/>
+        </w:rPr>
+        <w:t>primary aim of this project</w:t>
+      </w:r>
+      <w:r>
+        <w:rPr>
+          <w:lang w:val="en-IE"/>
+        </w:rPr>
+        <w:t>.</w:t>
+      </w:r>
+    </w:p>
+    <w:p>
+      <w:pPr>
+        <w:pStyle w:val="Heading1"/>
+      </w:pPr>
+      <w:bookmarkStart w:id="150" w:name="_Toc225879356"/>
       <w:r>
         <w:t>1</w:t>
       </w:r>
       <w:r>
-        <w:t>0</w:t>
+        <w:t>1</w:t>
       </w:r>
       <w:r>
         <w:t>. Conclusion</w:t>
       </w:r>
       <w:bookmarkEnd w:id="141"/>
-      <w:bookmarkEnd w:id="149"/>
+      <w:bookmarkEnd w:id="150"/>
     </w:p>
     <w:p>
       <w:r>
@@ -29589,18 +30379,23 @@
     <w:p/>
     <w:p/>
     <w:p/>
+    <w:p/>
+    <w:p/>
+    <w:p/>
+    <w:p/>
+    <w:p/>
     <w:p>
       <w:pPr>
         <w:pStyle w:val="Heading1"/>
       </w:pPr>
-      <w:bookmarkStart w:id="150" w:name="_Toc220478473"/>
-      <w:bookmarkStart w:id="151" w:name="_Toc225111938"/>
+      <w:bookmarkStart w:id="151" w:name="_Toc220478473"/>
+      <w:bookmarkStart w:id="152" w:name="_Toc225879357"/>
       <w:r>
         <w:lastRenderedPageBreak/>
         <w:t>References</w:t>
       </w:r>
-      <w:bookmarkEnd w:id="150"/>
       <w:bookmarkEnd w:id="151"/>
+      <w:bookmarkEnd w:id="152"/>
     </w:p>
     <w:p>
       <w:pPr>
@@ -31004,7 +31799,31 @@
         <w:rPr>
           <w:lang w:val="en-IE"/>
         </w:rPr>
-        <w:t xml:space="preserve"> 2026).</w:t>
+        <w:t xml:space="preserve"> 2026)</w:t>
+      </w:r>
+      <w:r>
+        <w:rPr>
+          <w:lang w:val="en-IE"/>
+        </w:rPr>
+        <w:t xml:space="preserve"> (see </w:t>
+      </w:r>
+      <w:r>
+        <w:rPr>
+          <w:lang w:val="en-IE"/>
+        </w:rPr>
+        <w:t>Appendix C</w:t>
+      </w:r>
+      <w:r>
+        <w:rPr>
+          <w:lang w:val="en-IE"/>
+        </w:rPr>
+        <w:t>)</w:t>
+      </w:r>
+      <w:r>
+        <w:rPr>
+          <w:lang w:val="en-IE"/>
+        </w:rPr>
+        <w:t>.</w:t>
       </w:r>
     </w:p>
     <w:p>
@@ -31048,14 +31867,14 @@
       <w:pPr>
         <w:pStyle w:val="Heading1"/>
       </w:pPr>
-      <w:bookmarkStart w:id="152" w:name="_Toc220478474"/>
-      <w:bookmarkStart w:id="153" w:name="_Toc225111939"/>
+      <w:bookmarkStart w:id="153" w:name="_Toc220478474"/>
+      <w:bookmarkStart w:id="154" w:name="_Toc225879358"/>
       <w:r>
         <w:lastRenderedPageBreak/>
         <w:t>Appendices</w:t>
       </w:r>
-      <w:bookmarkEnd w:id="152"/>
       <w:bookmarkEnd w:id="153"/>
+      <w:bookmarkEnd w:id="154"/>
     </w:p>
     <w:p>
       <w:r>
@@ -31159,7 +31978,7 @@
       <w:pPr>
         <w:pStyle w:val="Caption"/>
       </w:pPr>
-      <w:bookmarkStart w:id="154" w:name="_Toc225111982"/>
+      <w:bookmarkStart w:id="155" w:name="_Toc225111982"/>
       <w:r>
         <w:t xml:space="preserve">Figure </w:t>
       </w:r>
@@ -31177,7 +31996,7 @@
       <w:r>
         <w:t>System Architecture Diagram: High-Level</w:t>
       </w:r>
-      <w:bookmarkEnd w:id="154"/>
+      <w:bookmarkEnd w:id="155"/>
     </w:p>
     <w:p>
       <w:pPr>
@@ -31477,7 +32296,7 @@
                                 <w:szCs w:val="22"/>
                               </w:rPr>
                             </w:pPr>
-                            <w:bookmarkStart w:id="155" w:name="_Toc225111983"/>
+                            <w:bookmarkStart w:id="156" w:name="_Toc225111983"/>
                             <w:r>
                               <w:t xml:space="preserve">Figure </w:t>
                             </w:r>
@@ -31504,7 +32323,7 @@
                             <w:r>
                               <w:t>Client Layer</w:t>
                             </w:r>
-                            <w:bookmarkEnd w:id="155"/>
+                            <w:bookmarkEnd w:id="156"/>
                           </w:p>
                         </w:txbxContent>
                       </wps:txbx>
@@ -31535,7 +32354,7 @@
                           <w:szCs w:val="22"/>
                         </w:rPr>
                       </w:pPr>
-                      <w:bookmarkStart w:id="156" w:name="_Toc225111983"/>
+                      <w:bookmarkStart w:id="157" w:name="_Toc225111983"/>
                       <w:r>
                         <w:t xml:space="preserve">Figure </w:t>
                       </w:r>
@@ -31562,7 +32381,7 @@
                       <w:r>
                         <w:t>Client Layer</w:t>
                       </w:r>
-                      <w:bookmarkEnd w:id="156"/>
+                      <w:bookmarkEnd w:id="157"/>
                     </w:p>
                   </w:txbxContent>
                 </v:textbox>
@@ -31628,7 +32447,7 @@
                                 <w:szCs w:val="22"/>
                               </w:rPr>
                             </w:pPr>
-                            <w:bookmarkStart w:id="157" w:name="_Toc225111984"/>
+                            <w:bookmarkStart w:id="158" w:name="_Toc225111984"/>
                             <w:r>
                               <w:t xml:space="preserve">Figure </w:t>
                             </w:r>
@@ -31652,7 +32471,7 @@
                             <w:r>
                               <w:t xml:space="preserve"> Layer</w:t>
                             </w:r>
-                            <w:bookmarkEnd w:id="157"/>
+                            <w:bookmarkEnd w:id="158"/>
                           </w:p>
                         </w:txbxContent>
                       </wps:txbx>
@@ -31683,7 +32502,7 @@
                           <w:szCs w:val="22"/>
                         </w:rPr>
                       </w:pPr>
-                      <w:bookmarkStart w:id="158" w:name="_Toc225111984"/>
+                      <w:bookmarkStart w:id="159" w:name="_Toc225111984"/>
                       <w:r>
                         <w:t xml:space="preserve">Figure </w:t>
                       </w:r>
@@ -31707,7 +32526,7 @@
                       <w:r>
                         <w:t xml:space="preserve"> Layer</w:t>
                       </w:r>
-                      <w:bookmarkEnd w:id="158"/>
+                      <w:bookmarkEnd w:id="159"/>
                     </w:p>
                   </w:txbxContent>
                 </v:textbox>
@@ -32039,7 +32858,7 @@
         <w:pStyle w:val="Caption"/>
         <w:jc w:val="center"/>
       </w:pPr>
-      <w:bookmarkStart w:id="159" w:name="_Toc225111985"/>
+      <w:bookmarkStart w:id="160" w:name="_Toc225111985"/>
       <w:r>
         <w:t xml:space="preserve">Figure </w:t>
       </w:r>
@@ -32057,7 +32876,7 @@
       <w:r>
         <w:t>Architecture Diagram: Data Layer</w:t>
       </w:r>
-      <w:bookmarkEnd w:id="159"/>
+      <w:bookmarkEnd w:id="160"/>
     </w:p>
     <w:p>
       <w:pPr>
@@ -32475,7 +33294,7 @@
                                 <w:szCs w:val="22"/>
                               </w:rPr>
                             </w:pPr>
-                            <w:bookmarkStart w:id="160" w:name="_Toc225111986"/>
+                            <w:bookmarkStart w:id="161" w:name="_Toc225111986"/>
                             <w:r>
                               <w:t xml:space="preserve">Figure </w:t>
                             </w:r>
@@ -32496,7 +33315,7 @@
                             <w:r>
                               <w:t>Cryptographic Service Layer</w:t>
                             </w:r>
-                            <w:bookmarkEnd w:id="160"/>
+                            <w:bookmarkEnd w:id="161"/>
                           </w:p>
                         </w:txbxContent>
                       </wps:txbx>
@@ -32526,7 +33345,7 @@
                           <w:szCs w:val="22"/>
                         </w:rPr>
                       </w:pPr>
-                      <w:bookmarkStart w:id="161" w:name="_Toc225111986"/>
+                      <w:bookmarkStart w:id="162" w:name="_Toc225111986"/>
                       <w:r>
                         <w:t xml:space="preserve">Figure </w:t>
                       </w:r>
@@ -32547,7 +33366,7 @@
                       <w:r>
                         <w:t>Cryptographic Service Layer</w:t>
                       </w:r>
-                      <w:bookmarkEnd w:id="161"/>
+                      <w:bookmarkEnd w:id="162"/>
                     </w:p>
                   </w:txbxContent>
                 </v:textbox>
@@ -32606,7 +33425,7 @@
                                 <w:szCs w:val="22"/>
                               </w:rPr>
                             </w:pPr>
-                            <w:bookmarkStart w:id="162" w:name="_Toc225111987"/>
+                            <w:bookmarkStart w:id="163" w:name="_Toc225111987"/>
                             <w:r>
                               <w:t xml:space="preserve">Figure </w:t>
                             </w:r>
@@ -32627,7 +33446,7 @@
                             <w:r>
                               <w:t>ROS Integration Layer</w:t>
                             </w:r>
-                            <w:bookmarkEnd w:id="162"/>
+                            <w:bookmarkEnd w:id="163"/>
                           </w:p>
                         </w:txbxContent>
                       </wps:txbx>
@@ -32660,7 +33479,7 @@
                           <w:szCs w:val="22"/>
                         </w:rPr>
                       </w:pPr>
-                      <w:bookmarkStart w:id="163" w:name="_Toc225111987"/>
+                      <w:bookmarkStart w:id="164" w:name="_Toc225111987"/>
                       <w:r>
                         <w:t xml:space="preserve">Figure </w:t>
                       </w:r>
@@ -32681,7 +33500,7 @@
                       <w:r>
                         <w:t>ROS Integration Layer</w:t>
                       </w:r>
-                      <w:bookmarkEnd w:id="163"/>
+                      <w:bookmarkEnd w:id="164"/>
                     </w:p>
                   </w:txbxContent>
                 </v:textbox>
@@ -34291,6 +35110,155 @@
       </w:pPr>
     </w:p>
     <w:p/>
+    <w:p/>
+    <w:p/>
+    <w:p/>
+    <w:p>
+      <w:pPr>
+        <w:rPr>
+          <w:b/>
+          <w:bCs/>
+        </w:rPr>
+      </w:pPr>
+      <w:r>
+        <w:rPr>
+          <w:b/>
+          <w:bCs/>
+        </w:rPr>
+        <w:lastRenderedPageBreak/>
+        <w:t xml:space="preserve">Appendix </w:t>
+      </w:r>
+      <w:r>
+        <w:rPr>
+          <w:b/>
+          <w:bCs/>
+        </w:rPr>
+        <w:t>C</w:t>
+      </w:r>
+      <w:r>
+        <w:rPr>
+          <w:b/>
+          <w:bCs/>
+        </w:rPr>
+        <w:t xml:space="preserve">: </w:t>
+      </w:r>
+      <w:r>
+        <w:rPr>
+          <w:b/>
+          <w:bCs/>
+        </w:rPr>
+        <w:t>Use of AI</w:t>
+      </w:r>
+      <w:r>
+        <w:rPr>
+          <w:b/>
+          <w:bCs/>
+        </w:rPr>
+        <w:t>, chat contents</w:t>
+      </w:r>
+    </w:p>
+    <w:p>
+      <w:pPr>
+        <w:pStyle w:val="ListParagraph"/>
+        <w:numPr>
+          <w:ilvl w:val="0"/>
+          <w:numId w:val="147"/>
+        </w:numPr>
+      </w:pPr>
+      <w:r>
+        <w:t xml:space="preserve">Initial </w:t>
+      </w:r>
+      <w:r>
+        <w:t xml:space="preserve">research on </w:t>
+      </w:r>
+      <w:r>
+        <w:t>ROS API authentication:</w:t>
+      </w:r>
+    </w:p>
+    <w:p>
+      <w:r>
+        <w:object w:dxaOrig="3180" w:dyaOrig="816" w14:anchorId="5A6676BB">
+          <v:shapetype id="_x0000_t75" coordsize="21600,21600" o:spt="75" o:preferrelative="t" path="m@4@5l@4@11@9@11@9@5xe" filled="f" stroked="f">
+            <v:stroke joinstyle="miter"/>
+            <v:formulas>
+              <v:f eqn="if lineDrawn pixelLineWidth 0"/>
+              <v:f eqn="sum @0 1 0"/>
+              <v:f eqn="sum 0 0 @1"/>
+              <v:f eqn="prod @2 1 2"/>
+              <v:f eqn="prod @3 21600 pixelWidth"/>
+              <v:f eqn="prod @3 21600 pixelHeight"/>
+              <v:f eqn="sum @0 0 1"/>
+              <v:f eqn="prod @6 1 2"/>
+              <v:f eqn="prod @7 21600 pixelWidth"/>
+              <v:f eqn="sum @8 21600 0"/>
+              <v:f eqn="prod @7 21600 pixelHeight"/>
+              <v:f eqn="sum @10 21600 0"/>
+            </v:formulas>
+            <v:path o:extrusionok="f" gradientshapeok="t" o:connecttype="rect"/>
+            <o:lock v:ext="edit" aspectratio="t"/>
+          </v:shapetype>
+          <v:shape id="_x0000_i1030" type="#_x0000_t75" style="width:159pt;height:40.8pt" o:ole="">
+            <v:imagedata r:id="rId88" o:title=""/>
+          </v:shape>
+          <o:OLEObject Type="Embed" ProgID="Package" ShapeID="_x0000_i1030" DrawAspect="Content" ObjectID="_1836492164" r:id="rId89"/>
+        </w:object>
+      </w:r>
+    </w:p>
+    <w:p/>
+    <w:p>
+      <w:pPr>
+        <w:pStyle w:val="ListParagraph"/>
+        <w:numPr>
+          <w:ilvl w:val="0"/>
+          <w:numId w:val="147"/>
+        </w:numPr>
+      </w:pPr>
+      <w:r>
+        <w:t xml:space="preserve">Understanding of </w:t>
+      </w:r>
+      <w:r>
+        <w:t>data compilation for submission provided by work:</w:t>
+      </w:r>
+    </w:p>
+    <w:p>
+      <w:r>
+        <w:object w:dxaOrig="2676" w:dyaOrig="816" w14:anchorId="7973F11D">
+          <v:shape id="_x0000_i1031" type="#_x0000_t75" style="width:133.8pt;height:40.8pt" o:ole="">
+            <v:imagedata r:id="rId90" o:title=""/>
+          </v:shape>
+          <o:OLEObject Type="Embed" ProgID="Package" ShapeID="_x0000_i1031" DrawAspect="Content" ObjectID="_1836492165" r:id="rId91"/>
+        </w:object>
+      </w:r>
+    </w:p>
+    <w:p/>
+    <w:p>
+      <w:pPr>
+        <w:pStyle w:val="ListParagraph"/>
+        <w:numPr>
+          <w:ilvl w:val="0"/>
+          <w:numId w:val="147"/>
+        </w:numPr>
+      </w:pPr>
+      <w:r>
+        <w:t xml:space="preserve">Debugging during section </w:t>
+      </w:r>
+      <w:r>
+        <w:t>6.13 ERR Submission Lifecycle and ROS API Integration</w:t>
+      </w:r>
+      <w:r>
+        <w:t>:</w:t>
+      </w:r>
+    </w:p>
+    <w:p>
+      <w:r>
+        <w:object w:dxaOrig="2220" w:dyaOrig="816" w14:anchorId="2CFADABF">
+          <v:shape id="_x0000_i1027" type="#_x0000_t75" style="width:111pt;height:40.8pt" o:ole="">
+            <v:imagedata r:id="rId92" o:title=""/>
+          </v:shape>
+          <o:OLEObject Type="Embed" ProgID="Package" ShapeID="_x0000_i1027" DrawAspect="Content" ObjectID="_1836492166" r:id="rId93"/>
+        </w:object>
+      </w:r>
+    </w:p>
     <w:sectPr>
       <w:pgSz w:w="12240" w:h="15840"/>
       <w:pgMar w:top="1440" w:right="1440" w:bottom="1440" w:left="1134" w:header="720" w:footer="720" w:gutter="0"/>
@@ -47341,6 +48309,95 @@
     </w:lvl>
   </w:abstractNum>
   <w:abstractNum w:abstractNumId="110" w15:restartNumberingAfterBreak="0">
+    <w:nsid w:val="61D32B8C"/>
+    <w:multiLevelType w:val="hybridMultilevel"/>
+    <w:tmpl w:val="92B6B4FE"/>
+    <w:lvl w:ilvl="0" w:tplc="1809000F">
+      <w:start w:val="1"/>
+      <w:numFmt w:val="decimal"/>
+      <w:lvlText w:val="%1."/>
+      <w:lvlJc w:val="left"/>
+      <w:pPr>
+        <w:ind w:left="720" w:hanging="360"/>
+      </w:pPr>
+      <w:rPr>
+        <w:rFonts w:hint="default"/>
+      </w:rPr>
+    </w:lvl>
+    <w:lvl w:ilvl="1" w:tplc="18090019" w:tentative="1">
+      <w:start w:val="1"/>
+      <w:numFmt w:val="lowerLetter"/>
+      <w:lvlText w:val="%2."/>
+      <w:lvlJc w:val="left"/>
+      <w:pPr>
+        <w:ind w:left="1440" w:hanging="360"/>
+      </w:pPr>
+    </w:lvl>
+    <w:lvl w:ilvl="2" w:tplc="1809001B" w:tentative="1">
+      <w:start w:val="1"/>
+      <w:numFmt w:val="lowerRoman"/>
+      <w:lvlText w:val="%3."/>
+      <w:lvlJc w:val="right"/>
+      <w:pPr>
+        <w:ind w:left="2160" w:hanging="180"/>
+      </w:pPr>
+    </w:lvl>
+    <w:lvl w:ilvl="3" w:tplc="1809000F" w:tentative="1">
+      <w:start w:val="1"/>
+      <w:numFmt w:val="decimal"/>
+      <w:lvlText w:val="%4."/>
+      <w:lvlJc w:val="left"/>
+      <w:pPr>
+        <w:ind w:left="2880" w:hanging="360"/>
+      </w:pPr>
+    </w:lvl>
+    <w:lvl w:ilvl="4" w:tplc="18090019" w:tentative="1">
+      <w:start w:val="1"/>
+      <w:numFmt w:val="lowerLetter"/>
+      <w:lvlText w:val="%5."/>
+      <w:lvlJc w:val="left"/>
+      <w:pPr>
+        <w:ind w:left="3600" w:hanging="360"/>
+      </w:pPr>
+    </w:lvl>
+    <w:lvl w:ilvl="5" w:tplc="1809001B" w:tentative="1">
+      <w:start w:val="1"/>
+      <w:numFmt w:val="lowerRoman"/>
+      <w:lvlText w:val="%6."/>
+      <w:lvlJc w:val="right"/>
+      <w:pPr>
+        <w:ind w:left="4320" w:hanging="180"/>
+      </w:pPr>
+    </w:lvl>
+    <w:lvl w:ilvl="6" w:tplc="1809000F" w:tentative="1">
+      <w:start w:val="1"/>
+      <w:numFmt w:val="decimal"/>
+      <w:lvlText w:val="%7."/>
+      <w:lvlJc w:val="left"/>
+      <w:pPr>
+        <w:ind w:left="5040" w:hanging="360"/>
+      </w:pPr>
+    </w:lvl>
+    <w:lvl w:ilvl="7" w:tplc="18090019" w:tentative="1">
+      <w:start w:val="1"/>
+      <w:numFmt w:val="lowerLetter"/>
+      <w:lvlText w:val="%8."/>
+      <w:lvlJc w:val="left"/>
+      <w:pPr>
+        <w:ind w:left="5760" w:hanging="360"/>
+      </w:pPr>
+    </w:lvl>
+    <w:lvl w:ilvl="8" w:tplc="1809001B" w:tentative="1">
+      <w:start w:val="1"/>
+      <w:numFmt w:val="lowerRoman"/>
+      <w:lvlText w:val="%9."/>
+      <w:lvlJc w:val="right"/>
+      <w:pPr>
+        <w:ind w:left="6480" w:hanging="180"/>
+      </w:pPr>
+    </w:lvl>
+  </w:abstractNum>
+  <w:abstractNum w:abstractNumId="111" w15:restartNumberingAfterBreak="0">
     <w:nsid w:val="643E649B"/>
     <w:multiLevelType w:val="multilevel"/>
     <w:tmpl w:val="B13CEE00"/>
@@ -47453,7 +48510,7 @@
       </w:pPr>
     </w:lvl>
   </w:abstractNum>
-  <w:abstractNum w:abstractNumId="111" w15:restartNumberingAfterBreak="0">
+  <w:abstractNum w:abstractNumId="112" w15:restartNumberingAfterBreak="0">
     <w:nsid w:val="64CB17D1"/>
     <w:multiLevelType w:val="hybridMultilevel"/>
     <w:tmpl w:val="CC46547A"/>
@@ -47565,7 +48622,7 @@
       </w:rPr>
     </w:lvl>
   </w:abstractNum>
-  <w:abstractNum w:abstractNumId="112" w15:restartNumberingAfterBreak="0">
+  <w:abstractNum w:abstractNumId="113" w15:restartNumberingAfterBreak="0">
     <w:nsid w:val="64D17545"/>
     <w:multiLevelType w:val="hybridMultilevel"/>
     <w:tmpl w:val="6A966B12"/>
@@ -47678,7 +48735,7 @@
       </w:rPr>
     </w:lvl>
   </w:abstractNum>
-  <w:abstractNum w:abstractNumId="113" w15:restartNumberingAfterBreak="0">
+  <w:abstractNum w:abstractNumId="114" w15:restartNumberingAfterBreak="0">
     <w:nsid w:val="655A74FF"/>
     <w:multiLevelType w:val="hybridMultilevel"/>
     <w:tmpl w:val="76CE1B52"/>
@@ -47791,7 +48848,7 @@
       </w:rPr>
     </w:lvl>
   </w:abstractNum>
-  <w:abstractNum w:abstractNumId="114" w15:restartNumberingAfterBreak="0">
+  <w:abstractNum w:abstractNumId="115" w15:restartNumberingAfterBreak="0">
     <w:nsid w:val="65C74565"/>
     <w:multiLevelType w:val="multilevel"/>
     <w:tmpl w:val="F55ED266"/>
@@ -47904,7 +48961,7 @@
       </w:pPr>
     </w:lvl>
   </w:abstractNum>
-  <w:abstractNum w:abstractNumId="115" w15:restartNumberingAfterBreak="0">
+  <w:abstractNum w:abstractNumId="116" w15:restartNumberingAfterBreak="0">
     <w:nsid w:val="65DB5B1D"/>
     <w:multiLevelType w:val="hybridMultilevel"/>
     <w:tmpl w:val="62F86058"/>
@@ -48016,7 +49073,7 @@
       </w:rPr>
     </w:lvl>
   </w:abstractNum>
-  <w:abstractNum w:abstractNumId="116" w15:restartNumberingAfterBreak="0">
+  <w:abstractNum w:abstractNumId="117" w15:restartNumberingAfterBreak="0">
     <w:nsid w:val="67EE6619"/>
     <w:multiLevelType w:val="multilevel"/>
     <w:tmpl w:val="1F901706"/>
@@ -48165,7 +49222,7 @@
       </w:rPr>
     </w:lvl>
   </w:abstractNum>
-  <w:abstractNum w:abstractNumId="117" w15:restartNumberingAfterBreak="0">
+  <w:abstractNum w:abstractNumId="118" w15:restartNumberingAfterBreak="0">
     <w:nsid w:val="67FB54BE"/>
     <w:multiLevelType w:val="multilevel"/>
     <w:tmpl w:val="AA08930E"/>
@@ -48314,7 +49371,7 @@
       </w:rPr>
     </w:lvl>
   </w:abstractNum>
-  <w:abstractNum w:abstractNumId="118" w15:restartNumberingAfterBreak="0">
+  <w:abstractNum w:abstractNumId="119" w15:restartNumberingAfterBreak="0">
     <w:nsid w:val="687D4041"/>
     <w:multiLevelType w:val="multilevel"/>
     <w:tmpl w:val="75EE99E0"/>
@@ -48463,7 +49520,7 @@
       </w:rPr>
     </w:lvl>
   </w:abstractNum>
-  <w:abstractNum w:abstractNumId="119" w15:restartNumberingAfterBreak="0">
+  <w:abstractNum w:abstractNumId="120" w15:restartNumberingAfterBreak="0">
     <w:nsid w:val="6A481524"/>
     <w:multiLevelType w:val="hybridMultilevel"/>
     <w:tmpl w:val="64D01DBC"/>
@@ -48575,7 +49632,7 @@
       </w:rPr>
     </w:lvl>
   </w:abstractNum>
-  <w:abstractNum w:abstractNumId="120" w15:restartNumberingAfterBreak="0">
+  <w:abstractNum w:abstractNumId="121" w15:restartNumberingAfterBreak="0">
     <w:nsid w:val="6AAA3DC1"/>
     <w:multiLevelType w:val="multilevel"/>
     <w:tmpl w:val="91AA9C82"/>
@@ -48724,7 +49781,7 @@
       </w:rPr>
     </w:lvl>
   </w:abstractNum>
-  <w:abstractNum w:abstractNumId="121" w15:restartNumberingAfterBreak="0">
+  <w:abstractNum w:abstractNumId="122" w15:restartNumberingAfterBreak="0">
     <w:nsid w:val="6B241B77"/>
     <w:multiLevelType w:val="hybridMultilevel"/>
     <w:tmpl w:val="9B74165E"/>
@@ -48836,7 +49893,7 @@
       </w:rPr>
     </w:lvl>
   </w:abstractNum>
-  <w:abstractNum w:abstractNumId="122" w15:restartNumberingAfterBreak="0">
+  <w:abstractNum w:abstractNumId="123" w15:restartNumberingAfterBreak="0">
     <w:nsid w:val="6B253463"/>
     <w:multiLevelType w:val="multilevel"/>
     <w:tmpl w:val="E3FE2F54"/>
@@ -48985,7 +50042,7 @@
       </w:rPr>
     </w:lvl>
   </w:abstractNum>
-  <w:abstractNum w:abstractNumId="123" w15:restartNumberingAfterBreak="0">
+  <w:abstractNum w:abstractNumId="124" w15:restartNumberingAfterBreak="0">
     <w:nsid w:val="6B2E02C3"/>
     <w:multiLevelType w:val="hybridMultilevel"/>
     <w:tmpl w:val="63AE77C4"/>
@@ -49098,7 +50155,7 @@
       </w:rPr>
     </w:lvl>
   </w:abstractNum>
-  <w:abstractNum w:abstractNumId="124" w15:restartNumberingAfterBreak="0">
+  <w:abstractNum w:abstractNumId="125" w15:restartNumberingAfterBreak="0">
     <w:nsid w:val="6BC94929"/>
     <w:multiLevelType w:val="multilevel"/>
     <w:tmpl w:val="E98A0E30"/>
@@ -49247,7 +50304,7 @@
       </w:rPr>
     </w:lvl>
   </w:abstractNum>
-  <w:abstractNum w:abstractNumId="125" w15:restartNumberingAfterBreak="0">
+  <w:abstractNum w:abstractNumId="126" w15:restartNumberingAfterBreak="0">
     <w:nsid w:val="6D1C0EBF"/>
     <w:multiLevelType w:val="hybridMultilevel"/>
     <w:tmpl w:val="AAFC1DF6"/>
@@ -49336,7 +50393,7 @@
       </w:pPr>
     </w:lvl>
   </w:abstractNum>
-  <w:abstractNum w:abstractNumId="126" w15:restartNumberingAfterBreak="0">
+  <w:abstractNum w:abstractNumId="127" w15:restartNumberingAfterBreak="0">
     <w:nsid w:val="6EE06575"/>
     <w:multiLevelType w:val="multilevel"/>
     <w:tmpl w:val="2C40D95C"/>
@@ -49485,7 +50542,7 @@
       </w:rPr>
     </w:lvl>
   </w:abstractNum>
-  <w:abstractNum w:abstractNumId="127" w15:restartNumberingAfterBreak="0">
+  <w:abstractNum w:abstractNumId="128" w15:restartNumberingAfterBreak="0">
     <w:nsid w:val="708324ED"/>
     <w:multiLevelType w:val="hybridMultilevel"/>
     <w:tmpl w:val="B9741A0E"/>
@@ -49571,7 +50628,96 @@
       </w:pPr>
     </w:lvl>
   </w:abstractNum>
-  <w:abstractNum w:abstractNumId="128" w15:restartNumberingAfterBreak="0">
+  <w:abstractNum w:abstractNumId="129" w15:restartNumberingAfterBreak="0">
+    <w:nsid w:val="70861178"/>
+    <w:multiLevelType w:val="hybridMultilevel"/>
+    <w:tmpl w:val="C0482A4C"/>
+    <w:lvl w:ilvl="0" w:tplc="1809000F">
+      <w:start w:val="1"/>
+      <w:numFmt w:val="decimal"/>
+      <w:lvlText w:val="%1."/>
+      <w:lvlJc w:val="left"/>
+      <w:pPr>
+        <w:ind w:left="720" w:hanging="360"/>
+      </w:pPr>
+      <w:rPr>
+        <w:rFonts w:hint="default"/>
+      </w:rPr>
+    </w:lvl>
+    <w:lvl w:ilvl="1" w:tplc="18090019" w:tentative="1">
+      <w:start w:val="1"/>
+      <w:numFmt w:val="lowerLetter"/>
+      <w:lvlText w:val="%2."/>
+      <w:lvlJc w:val="left"/>
+      <w:pPr>
+        <w:ind w:left="1440" w:hanging="360"/>
+      </w:pPr>
+    </w:lvl>
+    <w:lvl w:ilvl="2" w:tplc="1809001B" w:tentative="1">
+      <w:start w:val="1"/>
+      <w:numFmt w:val="lowerRoman"/>
+      <w:lvlText w:val="%3."/>
+      <w:lvlJc w:val="right"/>
+      <w:pPr>
+        <w:ind w:left="2160" w:hanging="180"/>
+      </w:pPr>
+    </w:lvl>
+    <w:lvl w:ilvl="3" w:tplc="1809000F" w:tentative="1">
+      <w:start w:val="1"/>
+      <w:numFmt w:val="decimal"/>
+      <w:lvlText w:val="%4."/>
+      <w:lvlJc w:val="left"/>
+      <w:pPr>
+        <w:ind w:left="2880" w:hanging="360"/>
+      </w:pPr>
+    </w:lvl>
+    <w:lvl w:ilvl="4" w:tplc="18090019" w:tentative="1">
+      <w:start w:val="1"/>
+      <w:numFmt w:val="lowerLetter"/>
+      <w:lvlText w:val="%5."/>
+      <w:lvlJc w:val="left"/>
+      <w:pPr>
+        <w:ind w:left="3600" w:hanging="360"/>
+      </w:pPr>
+    </w:lvl>
+    <w:lvl w:ilvl="5" w:tplc="1809001B" w:tentative="1">
+      <w:start w:val="1"/>
+      <w:numFmt w:val="lowerRoman"/>
+      <w:lvlText w:val="%6."/>
+      <w:lvlJc w:val="right"/>
+      <w:pPr>
+        <w:ind w:left="4320" w:hanging="180"/>
+      </w:pPr>
+    </w:lvl>
+    <w:lvl w:ilvl="6" w:tplc="1809000F" w:tentative="1">
+      <w:start w:val="1"/>
+      <w:numFmt w:val="decimal"/>
+      <w:lvlText w:val="%7."/>
+      <w:lvlJc w:val="left"/>
+      <w:pPr>
+        <w:ind w:left="5040" w:hanging="360"/>
+      </w:pPr>
+    </w:lvl>
+    <w:lvl w:ilvl="7" w:tplc="18090019" w:tentative="1">
+      <w:start w:val="1"/>
+      <w:numFmt w:val="lowerLetter"/>
+      <w:lvlText w:val="%8."/>
+      <w:lvlJc w:val="left"/>
+      <w:pPr>
+        <w:ind w:left="5760" w:hanging="360"/>
+      </w:pPr>
+    </w:lvl>
+    <w:lvl w:ilvl="8" w:tplc="1809001B" w:tentative="1">
+      <w:start w:val="1"/>
+      <w:numFmt w:val="lowerRoman"/>
+      <w:lvlText w:val="%9."/>
+      <w:lvlJc w:val="right"/>
+      <w:pPr>
+        <w:ind w:left="6480" w:hanging="180"/>
+      </w:pPr>
+    </w:lvl>
+  </w:abstractNum>
+  <w:abstractNum w:abstractNumId="130" w15:restartNumberingAfterBreak="0">
     <w:nsid w:val="70BC1F1E"/>
     <w:multiLevelType w:val="multilevel"/>
     <w:tmpl w:val="E94826D2"/>
@@ -49720,7 +50866,7 @@
       </w:rPr>
     </w:lvl>
   </w:abstractNum>
-  <w:abstractNum w:abstractNumId="129" w15:restartNumberingAfterBreak="0">
+  <w:abstractNum w:abstractNumId="131" w15:restartNumberingAfterBreak="0">
     <w:nsid w:val="714F3F2F"/>
     <w:multiLevelType w:val="hybridMultilevel"/>
     <w:tmpl w:val="388252F4"/>
@@ -49833,7 +50979,7 @@
       </w:rPr>
     </w:lvl>
   </w:abstractNum>
-  <w:abstractNum w:abstractNumId="130" w15:restartNumberingAfterBreak="0">
+  <w:abstractNum w:abstractNumId="132" w15:restartNumberingAfterBreak="0">
     <w:nsid w:val="740F34B1"/>
     <w:multiLevelType w:val="multilevel"/>
     <w:tmpl w:val="55E23D3A"/>
@@ -49946,7 +51092,7 @@
       </w:pPr>
     </w:lvl>
   </w:abstractNum>
-  <w:abstractNum w:abstractNumId="131" w15:restartNumberingAfterBreak="0">
+  <w:abstractNum w:abstractNumId="133" w15:restartNumberingAfterBreak="0">
     <w:nsid w:val="76B00721"/>
     <w:multiLevelType w:val="hybridMultilevel"/>
     <w:tmpl w:val="56E2AB0C"/>
@@ -50059,7 +51205,7 @@
       </w:rPr>
     </w:lvl>
   </w:abstractNum>
-  <w:abstractNum w:abstractNumId="132" w15:restartNumberingAfterBreak="0">
+  <w:abstractNum w:abstractNumId="134" w15:restartNumberingAfterBreak="0">
     <w:nsid w:val="76EC0D63"/>
     <w:multiLevelType w:val="hybridMultilevel"/>
     <w:tmpl w:val="A08E01B6"/>
@@ -50171,7 +51317,7 @@
       </w:rPr>
     </w:lvl>
   </w:abstractNum>
-  <w:abstractNum w:abstractNumId="133" w15:restartNumberingAfterBreak="0">
+  <w:abstractNum w:abstractNumId="135" w15:restartNumberingAfterBreak="0">
     <w:nsid w:val="774E2B35"/>
     <w:multiLevelType w:val="hybridMultilevel"/>
     <w:tmpl w:val="7FC08BE6"/>
@@ -50283,7 +51429,7 @@
       </w:rPr>
     </w:lvl>
   </w:abstractNum>
-  <w:abstractNum w:abstractNumId="134" w15:restartNumberingAfterBreak="0">
+  <w:abstractNum w:abstractNumId="136" w15:restartNumberingAfterBreak="0">
     <w:nsid w:val="779E2B4E"/>
     <w:multiLevelType w:val="multilevel"/>
     <w:tmpl w:val="10C82996"/>
@@ -50432,7 +51578,7 @@
       </w:rPr>
     </w:lvl>
   </w:abstractNum>
-  <w:abstractNum w:abstractNumId="135" w15:restartNumberingAfterBreak="0">
+  <w:abstractNum w:abstractNumId="137" w15:restartNumberingAfterBreak="0">
     <w:nsid w:val="7A462556"/>
     <w:multiLevelType w:val="multilevel"/>
     <w:tmpl w:val="2E44398A"/>
@@ -50581,7 +51727,7 @@
       </w:rPr>
     </w:lvl>
   </w:abstractNum>
-  <w:abstractNum w:abstractNumId="136" w15:restartNumberingAfterBreak="0">
+  <w:abstractNum w:abstractNumId="138" w15:restartNumberingAfterBreak="0">
     <w:nsid w:val="7A7E12FF"/>
     <w:multiLevelType w:val="multilevel"/>
     <w:tmpl w:val="E57A22F0"/>
@@ -50730,7 +51876,7 @@
       </w:rPr>
     </w:lvl>
   </w:abstractNum>
-  <w:abstractNum w:abstractNumId="137" w15:restartNumberingAfterBreak="0">
+  <w:abstractNum w:abstractNumId="139" w15:restartNumberingAfterBreak="0">
     <w:nsid w:val="7B182CC9"/>
     <w:multiLevelType w:val="hybridMultilevel"/>
     <w:tmpl w:val="AB6CDCFC"/>
@@ -50842,7 +51988,7 @@
       </w:rPr>
     </w:lvl>
   </w:abstractNum>
-  <w:abstractNum w:abstractNumId="138" w15:restartNumberingAfterBreak="0">
+  <w:abstractNum w:abstractNumId="140" w15:restartNumberingAfterBreak="0">
     <w:nsid w:val="7C4530A7"/>
     <w:multiLevelType w:val="multilevel"/>
     <w:tmpl w:val="1C3817AC"/>
@@ -50991,7 +52137,7 @@
       </w:rPr>
     </w:lvl>
   </w:abstractNum>
-  <w:abstractNum w:abstractNumId="139" w15:restartNumberingAfterBreak="0">
+  <w:abstractNum w:abstractNumId="141" w15:restartNumberingAfterBreak="0">
     <w:nsid w:val="7C6214EC"/>
     <w:multiLevelType w:val="hybridMultilevel"/>
     <w:tmpl w:val="8DE0522E"/>
@@ -51103,7 +52249,7 @@
       </w:rPr>
     </w:lvl>
   </w:abstractNum>
-  <w:abstractNum w:abstractNumId="140" w15:restartNumberingAfterBreak="0">
+  <w:abstractNum w:abstractNumId="142" w15:restartNumberingAfterBreak="0">
     <w:nsid w:val="7C9B23FF"/>
     <w:multiLevelType w:val="hybridMultilevel"/>
     <w:tmpl w:val="4A88A57C"/>
@@ -51215,7 +52361,7 @@
       </w:rPr>
     </w:lvl>
   </w:abstractNum>
-  <w:abstractNum w:abstractNumId="141" w15:restartNumberingAfterBreak="0">
+  <w:abstractNum w:abstractNumId="143" w15:restartNumberingAfterBreak="0">
     <w:nsid w:val="7CC61462"/>
     <w:multiLevelType w:val="multilevel"/>
     <w:tmpl w:val="5C84AB60"/>
@@ -51364,7 +52510,7 @@
       </w:rPr>
     </w:lvl>
   </w:abstractNum>
-  <w:abstractNum w:abstractNumId="142" w15:restartNumberingAfterBreak="0">
+  <w:abstractNum w:abstractNumId="144" w15:restartNumberingAfterBreak="0">
     <w:nsid w:val="7D241E28"/>
     <w:multiLevelType w:val="multilevel"/>
     <w:tmpl w:val="1C3817AC"/>
@@ -51513,7 +52659,7 @@
       </w:rPr>
     </w:lvl>
   </w:abstractNum>
-  <w:abstractNum w:abstractNumId="143" w15:restartNumberingAfterBreak="0">
+  <w:abstractNum w:abstractNumId="145" w15:restartNumberingAfterBreak="0">
     <w:nsid w:val="7E5A29B2"/>
     <w:multiLevelType w:val="multilevel"/>
     <w:tmpl w:val="AA0CFFBA"/>
@@ -51662,7 +52808,7 @@
       </w:rPr>
     </w:lvl>
   </w:abstractNum>
-  <w:abstractNum w:abstractNumId="144" w15:restartNumberingAfterBreak="0">
+  <w:abstractNum w:abstractNumId="146" w15:restartNumberingAfterBreak="0">
     <w:nsid w:val="7F04006D"/>
     <w:multiLevelType w:val="multilevel"/>
     <w:tmpl w:val="E4B6AAAC"/>
@@ -51839,13 +52985,13 @@
     <w:abstractNumId w:val="0"/>
   </w:num>
   <w:num w:numId="10" w16cid:durableId="1633051978">
-    <w:abstractNumId w:val="135"/>
+    <w:abstractNumId w:val="137"/>
   </w:num>
   <w:num w:numId="11" w16cid:durableId="1571232965">
     <w:abstractNumId w:val="105"/>
   </w:num>
   <w:num w:numId="12" w16cid:durableId="63452538">
-    <w:abstractNumId w:val="110"/>
+    <w:abstractNumId w:val="111"/>
   </w:num>
   <w:num w:numId="13" w16cid:durableId="2120252864">
     <w:abstractNumId w:val="96"/>
@@ -51854,7 +53000,7 @@
     <w:abstractNumId w:val="10"/>
   </w:num>
   <w:num w:numId="15" w16cid:durableId="116725065">
-    <w:abstractNumId w:val="114"/>
+    <w:abstractNumId w:val="115"/>
   </w:num>
   <w:num w:numId="16" w16cid:durableId="2001233364">
     <w:abstractNumId w:val="80"/>
@@ -51866,28 +53012,28 @@
     <w:abstractNumId w:val="72"/>
   </w:num>
   <w:num w:numId="19" w16cid:durableId="772554038">
-    <w:abstractNumId w:val="130"/>
+    <w:abstractNumId w:val="132"/>
   </w:num>
   <w:num w:numId="20" w16cid:durableId="1402487051">
-    <w:abstractNumId w:val="136"/>
+    <w:abstractNumId w:val="138"/>
   </w:num>
   <w:num w:numId="21" w16cid:durableId="462046309">
-    <w:abstractNumId w:val="122"/>
+    <w:abstractNumId w:val="123"/>
   </w:num>
   <w:num w:numId="22" w16cid:durableId="278074628">
-    <w:abstractNumId w:val="117"/>
+    <w:abstractNumId w:val="118"/>
   </w:num>
   <w:num w:numId="23" w16cid:durableId="1542982462">
-    <w:abstractNumId w:val="124"/>
+    <w:abstractNumId w:val="125"/>
   </w:num>
   <w:num w:numId="24" w16cid:durableId="435295903">
-    <w:abstractNumId w:val="141"/>
+    <w:abstractNumId w:val="143"/>
   </w:num>
   <w:num w:numId="25" w16cid:durableId="404500435">
-    <w:abstractNumId w:val="126"/>
+    <w:abstractNumId w:val="127"/>
   </w:num>
   <w:num w:numId="26" w16cid:durableId="1388801350">
-    <w:abstractNumId w:val="128"/>
+    <w:abstractNumId w:val="130"/>
   </w:num>
   <w:num w:numId="27" w16cid:durableId="553782093">
     <w:abstractNumId w:val="30"/>
@@ -51896,7 +53042,7 @@
     <w:abstractNumId w:val="75"/>
   </w:num>
   <w:num w:numId="29" w16cid:durableId="1198351486">
-    <w:abstractNumId w:val="120"/>
+    <w:abstractNumId w:val="121"/>
   </w:num>
   <w:num w:numId="30" w16cid:durableId="250549066">
     <w:abstractNumId w:val="18"/>
@@ -51908,7 +53054,7 @@
     <w:abstractNumId w:val="64"/>
   </w:num>
   <w:num w:numId="33" w16cid:durableId="1431269092">
-    <w:abstractNumId w:val="116"/>
+    <w:abstractNumId w:val="117"/>
   </w:num>
   <w:num w:numId="34" w16cid:durableId="537200468">
     <w:abstractNumId w:val="60"/>
@@ -51947,7 +53093,7 @@
     <w:abstractNumId w:val="33"/>
   </w:num>
   <w:num w:numId="46" w16cid:durableId="1756396547">
-    <w:abstractNumId w:val="134"/>
+    <w:abstractNumId w:val="136"/>
   </w:num>
   <w:num w:numId="47" w16cid:durableId="537283292">
     <w:abstractNumId w:val="31"/>
@@ -51956,7 +53102,7 @@
     <w:abstractNumId w:val="108"/>
   </w:num>
   <w:num w:numId="49" w16cid:durableId="212472665">
-    <w:abstractNumId w:val="113"/>
+    <w:abstractNumId w:val="114"/>
   </w:num>
   <w:num w:numId="50" w16cid:durableId="1887180070">
     <w:abstractNumId w:val="28"/>
@@ -51974,13 +53120,13 @@
     <w:abstractNumId w:val="17"/>
   </w:num>
   <w:num w:numId="55" w16cid:durableId="1557665752">
-    <w:abstractNumId w:val="131"/>
+    <w:abstractNumId w:val="133"/>
   </w:num>
   <w:num w:numId="56" w16cid:durableId="957182514">
     <w:abstractNumId w:val="25"/>
   </w:num>
   <w:num w:numId="57" w16cid:durableId="562565567">
-    <w:abstractNumId w:val="129"/>
+    <w:abstractNumId w:val="131"/>
   </w:num>
   <w:num w:numId="58" w16cid:durableId="1676421640">
     <w:abstractNumId w:val="9"/>
@@ -51989,7 +53135,7 @@
     <w:abstractNumId w:val="73"/>
   </w:num>
   <w:num w:numId="60" w16cid:durableId="517505007">
-    <w:abstractNumId w:val="143"/>
+    <w:abstractNumId w:val="145"/>
   </w:num>
   <w:num w:numId="61" w16cid:durableId="133833708">
     <w:abstractNumId w:val="68"/>
@@ -52016,7 +53162,7 @@
     <w:abstractNumId w:val="102"/>
   </w:num>
   <w:num w:numId="69" w16cid:durableId="938678769">
-    <w:abstractNumId w:val="125"/>
+    <w:abstractNumId w:val="126"/>
   </w:num>
   <w:num w:numId="70" w16cid:durableId="1991447276">
     <w:abstractNumId w:val="45"/>
@@ -52025,7 +53171,7 @@
     <w:abstractNumId w:val="24"/>
   </w:num>
   <w:num w:numId="72" w16cid:durableId="340160758">
-    <w:abstractNumId w:val="142"/>
+    <w:abstractNumId w:val="144"/>
   </w:num>
   <w:num w:numId="73" w16cid:durableId="363678772">
     <w:abstractNumId w:val="100"/>
@@ -52037,7 +53183,7 @@
     <w:abstractNumId w:val="53"/>
   </w:num>
   <w:num w:numId="76" w16cid:durableId="1234898907">
-    <w:abstractNumId w:val="138"/>
+    <w:abstractNumId w:val="140"/>
   </w:num>
   <w:num w:numId="77" w16cid:durableId="621614748">
     <w:abstractNumId w:val="26"/>
@@ -52055,7 +53201,7 @@
     <w:abstractNumId w:val="89"/>
   </w:num>
   <w:num w:numId="82" w16cid:durableId="1864979317">
-    <w:abstractNumId w:val="127"/>
+    <w:abstractNumId w:val="128"/>
   </w:num>
   <w:num w:numId="83" w16cid:durableId="62139595">
     <w:abstractNumId w:val="23"/>
@@ -52100,7 +53246,7 @@
     <w:abstractNumId w:val="69"/>
   </w:num>
   <w:num w:numId="97" w16cid:durableId="1838378080">
-    <w:abstractNumId w:val="119"/>
+    <w:abstractNumId w:val="120"/>
   </w:num>
   <w:num w:numId="98" w16cid:durableId="1444838595">
     <w:abstractNumId w:val="34"/>
@@ -52109,7 +53255,7 @@
     <w:abstractNumId w:val="98"/>
   </w:num>
   <w:num w:numId="100" w16cid:durableId="1225336106">
-    <w:abstractNumId w:val="139"/>
+    <w:abstractNumId w:val="141"/>
   </w:num>
   <w:num w:numId="101" w16cid:durableId="1150054967">
     <w:abstractNumId w:val="14"/>
@@ -52136,7 +53282,7 @@
     <w:abstractNumId w:val="65"/>
   </w:num>
   <w:num w:numId="109" w16cid:durableId="1584071256">
-    <w:abstractNumId w:val="118"/>
+    <w:abstractNumId w:val="119"/>
   </w:num>
   <w:num w:numId="110" w16cid:durableId="1318610310">
     <w:abstractNumId w:val="36"/>
@@ -52154,10 +53300,10 @@
     <w:abstractNumId w:val="104"/>
   </w:num>
   <w:num w:numId="115" w16cid:durableId="299500521">
-    <w:abstractNumId w:val="144"/>
+    <w:abstractNumId w:val="146"/>
   </w:num>
   <w:num w:numId="116" w16cid:durableId="1334995186">
-    <w:abstractNumId w:val="112"/>
+    <w:abstractNumId w:val="113"/>
   </w:num>
   <w:num w:numId="117" w16cid:durableId="559243007">
     <w:abstractNumId w:val="70"/>
@@ -52166,7 +53312,7 @@
     <w:abstractNumId w:val="79"/>
   </w:num>
   <w:num w:numId="119" w16cid:durableId="544560246">
-    <w:abstractNumId w:val="123"/>
+    <w:abstractNumId w:val="124"/>
   </w:num>
   <w:num w:numId="120" w16cid:durableId="108278628">
     <w:abstractNumId w:val="39"/>
@@ -52181,7 +53327,7 @@
     <w:abstractNumId w:val="19"/>
   </w:num>
   <w:num w:numId="124" w16cid:durableId="1819757832">
-    <w:abstractNumId w:val="115"/>
+    <w:abstractNumId w:val="116"/>
   </w:num>
   <w:num w:numId="125" w16cid:durableId="462970500">
     <w:abstractNumId w:val="42"/>
@@ -52193,10 +53339,10 @@
     <w:abstractNumId w:val="22"/>
   </w:num>
   <w:num w:numId="128" w16cid:durableId="996618222">
-    <w:abstractNumId w:val="121"/>
+    <w:abstractNumId w:val="122"/>
   </w:num>
   <w:num w:numId="129" w16cid:durableId="396635808">
-    <w:abstractNumId w:val="140"/>
+    <w:abstractNumId w:val="142"/>
   </w:num>
   <w:num w:numId="130" w16cid:durableId="1304390606">
     <w:abstractNumId w:val="11"/>
@@ -52220,19 +53366,19 @@
     <w:abstractNumId w:val="38"/>
   </w:num>
   <w:num w:numId="137" w16cid:durableId="1902448570">
-    <w:abstractNumId w:val="137"/>
+    <w:abstractNumId w:val="139"/>
   </w:num>
   <w:num w:numId="138" w16cid:durableId="218052781">
-    <w:abstractNumId w:val="133"/>
+    <w:abstractNumId w:val="135"/>
   </w:num>
   <w:num w:numId="139" w16cid:durableId="1735396468">
-    <w:abstractNumId w:val="111"/>
+    <w:abstractNumId w:val="112"/>
   </w:num>
   <w:num w:numId="140" w16cid:durableId="1699425603">
     <w:abstractNumId w:val="27"/>
   </w:num>
   <w:num w:numId="141" w16cid:durableId="1021399064">
-    <w:abstractNumId w:val="132"/>
+    <w:abstractNumId w:val="134"/>
   </w:num>
   <w:num w:numId="142" w16cid:durableId="245650448">
     <w:abstractNumId w:val="52"/>
@@ -52245,6 +53391,12 @@
   </w:num>
   <w:num w:numId="145" w16cid:durableId="146702282">
     <w:abstractNumId w:val="83"/>
+  </w:num>
+  <w:num w:numId="146" w16cid:durableId="2063014275">
+    <w:abstractNumId w:val="129"/>
+  </w:num>
+  <w:num w:numId="147" w16cid:durableId="455611501">
+    <w:abstractNumId w:val="110"/>
   </w:num>
 </w:numbering>
 </file>
@@ -52638,7 +53790,7 @@
   <w:style w:type="paragraph" w:default="1" w:styleId="Normal">
     <w:name w:val="Normal"/>
     <w:qFormat/>
-    <w:rsid w:val="005C7075"/>
+    <w:rsid w:val="007E7316"/>
     <w:rPr>
       <w:rFonts w:ascii="Calibri" w:hAnsi="Calibri"/>
     </w:rPr>

</xml_diff>